<commit_message>
Entrega 3: lanzador de la API y aclaracion del mensaje de validacion
Co-Authored-By: Claude Opus 5 <noreply@anthropic.com>
</commit_message>
<xml_diff>
--- a/entregas/Entrega3_RAFFO.docx
+++ b/entregas/Entrega3_RAFFO.docx
@@ -12,7 +12,7 @@
           <w:noProof/>
         </w:rPr>
         <w:drawing>
-          <wp:inline distT="0" distB="0" distL="0" distR="0" wp14:anchorId="154D0450" wp14:editId="46AB3DB7">
+          <wp:inline distT="0" distB="0" distL="0" distR="0" wp14:anchorId="639EAD23" wp14:editId="5964F4D9">
             <wp:extent cx="1466850" cy="314325"/>
             <wp:effectExtent l="0" t="0" r="0" b="0"/>
             <wp:docPr id="1" name="Imagen 1"/>
@@ -309,7 +309,7 @@
     <w:sdt>
       <w:sdtPr>
         <w:alias w:val="Índice"/>
-        <w:id w:val="1669824672"/>
+        <w:id w:val="-2116128396"/>
       </w:sdtPr>
       <w:sdtEndPr/>
       <w:sdtContent>
@@ -337,7 +337,7 @@
           <w:r>
             <w:fldChar w:fldCharType="separate"/>
           </w:r>
-          <w:hyperlink w:anchor="_Toc240535221" w:history="1">
+          <w:hyperlink w:anchor="_Toc240607990" w:history="1">
             <w:r>
               <w:rPr>
                 <w:rStyle w:val="Hipervnculo"/>
@@ -361,7 +361,7 @@
               <w:rPr>
                 <w:noProof/>
               </w:rPr>
-              <w:instrText xml:space="preserve"> PAGEREF _Toc240535221 \h </w:instrText>
+              <w:instrText xml:space="preserve"> PAGEREF _Toc240607990 \h </w:instrText>
             </w:r>
             <w:r>
               <w:rPr>
@@ -403,7 +403,7 @@
               <w14:ligatures w14:val="standardContextual"/>
             </w:rPr>
           </w:pPr>
-          <w:hyperlink w:anchor="_Toc240535222" w:history="1">
+          <w:hyperlink w:anchor="_Toc240607991" w:history="1">
             <w:r>
               <w:rPr>
                 <w:rStyle w:val="Hipervnculo"/>
@@ -427,7 +427,7 @@
               <w:rPr>
                 <w:noProof/>
               </w:rPr>
-              <w:instrText xml:space="preserve"> PAGEREF _Toc240535222 \h </w:instrText>
+              <w:instrText xml:space="preserve"> PAGEREF _Toc240607991 \h </w:instrText>
             </w:r>
             <w:r>
               <w:rPr>
@@ -469,7 +469,7 @@
               <w14:ligatures w14:val="standardContextual"/>
             </w:rPr>
           </w:pPr>
-          <w:hyperlink w:anchor="_Toc240535223" w:history="1">
+          <w:hyperlink w:anchor="_Toc240607992" w:history="1">
             <w:r>
               <w:rPr>
                 <w:rStyle w:val="Hipervnculo"/>
@@ -493,7 +493,7 @@
               <w:rPr>
                 <w:noProof/>
               </w:rPr>
-              <w:instrText xml:space="preserve"> PAGEREF _Toc240535223 \h </w:instrText>
+              <w:instrText xml:space="preserve"> PAGEREF _Toc240607992 \h </w:instrText>
             </w:r>
             <w:r>
               <w:rPr>
@@ -535,7 +535,7 @@
               <w14:ligatures w14:val="standardContextual"/>
             </w:rPr>
           </w:pPr>
-          <w:hyperlink w:anchor="_Toc240535224" w:history="1">
+          <w:hyperlink w:anchor="_Toc240607993" w:history="1">
             <w:r>
               <w:rPr>
                 <w:rStyle w:val="Hipervnculo"/>
@@ -559,7 +559,7 @@
               <w:rPr>
                 <w:noProof/>
               </w:rPr>
-              <w:instrText xml:space="preserve"> PAGEREF _Toc240535224 \h </w:instrText>
+              <w:instrText xml:space="preserve"> PAGEREF _Toc240607993 \h </w:instrText>
             </w:r>
             <w:r>
               <w:rPr>
@@ -601,7 +601,7 @@
               <w14:ligatures w14:val="standardContextual"/>
             </w:rPr>
           </w:pPr>
-          <w:hyperlink w:anchor="_Toc240535225" w:history="1">
+          <w:hyperlink w:anchor="_Toc240607994" w:history="1">
             <w:r>
               <w:rPr>
                 <w:rStyle w:val="Hipervnculo"/>
@@ -625,7 +625,7 @@
               <w:rPr>
                 <w:noProof/>
               </w:rPr>
-              <w:instrText xml:space="preserve"> PAGEREF _Toc240535225 \h </w:instrText>
+              <w:instrText xml:space="preserve"> PAGEREF _Toc240607994 \h </w:instrText>
             </w:r>
             <w:r>
               <w:rPr>
@@ -667,7 +667,7 @@
               <w14:ligatures w14:val="standardContextual"/>
             </w:rPr>
           </w:pPr>
-          <w:hyperlink w:anchor="_Toc240535226" w:history="1">
+          <w:hyperlink w:anchor="_Toc240607995" w:history="1">
             <w:r>
               <w:rPr>
                 <w:rStyle w:val="Hipervnculo"/>
@@ -691,7 +691,7 @@
               <w:rPr>
                 <w:noProof/>
               </w:rPr>
-              <w:instrText xml:space="preserve"> PAGEREF _Toc240535226 \h </w:instrText>
+              <w:instrText xml:space="preserve"> PAGEREF _Toc240607995 \h </w:instrText>
             </w:r>
             <w:r>
               <w:rPr>
@@ -733,7 +733,7 @@
               <w14:ligatures w14:val="standardContextual"/>
             </w:rPr>
           </w:pPr>
-          <w:hyperlink w:anchor="_Toc240535227" w:history="1">
+          <w:hyperlink w:anchor="_Toc240607996" w:history="1">
             <w:r>
               <w:rPr>
                 <w:rStyle w:val="Hipervnculo"/>
@@ -757,7 +757,7 @@
               <w:rPr>
                 <w:noProof/>
               </w:rPr>
-              <w:instrText xml:space="preserve"> PAGEREF _Toc240535227 \h </w:instrText>
+              <w:instrText xml:space="preserve"> PAGEREF _Toc240607996 \h </w:instrText>
             </w:r>
             <w:r>
               <w:rPr>
@@ -799,7 +799,7 @@
               <w14:ligatures w14:val="standardContextual"/>
             </w:rPr>
           </w:pPr>
-          <w:hyperlink w:anchor="_Toc240535228" w:history="1">
+          <w:hyperlink w:anchor="_Toc240607997" w:history="1">
             <w:r>
               <w:rPr>
                 <w:rStyle w:val="Hipervnculo"/>
@@ -823,7 +823,7 @@
               <w:rPr>
                 <w:noProof/>
               </w:rPr>
-              <w:instrText xml:space="preserve"> PAGEREF _Toc240535228 \h </w:instrText>
+              <w:instrText xml:space="preserve"> PAGEREF _Toc240607997 \h </w:instrText>
             </w:r>
             <w:r>
               <w:rPr>
@@ -865,7 +865,7 @@
               <w14:ligatures w14:val="standardContextual"/>
             </w:rPr>
           </w:pPr>
-          <w:hyperlink w:anchor="_Toc240535229" w:history="1">
+          <w:hyperlink w:anchor="_Toc240607998" w:history="1">
             <w:r>
               <w:rPr>
                 <w:rStyle w:val="Hipervnculo"/>
@@ -889,7 +889,7 @@
               <w:rPr>
                 <w:noProof/>
               </w:rPr>
-              <w:instrText xml:space="preserve"> PAGEREF _Toc240535229 \h </w:instrText>
+              <w:instrText xml:space="preserve"> PAGEREF _Toc240607998 \h </w:instrText>
             </w:r>
             <w:r>
               <w:rPr>
@@ -931,7 +931,7 @@
               <w14:ligatures w14:val="standardContextual"/>
             </w:rPr>
           </w:pPr>
-          <w:hyperlink w:anchor="_Toc240535230" w:history="1">
+          <w:hyperlink w:anchor="_Toc240607999" w:history="1">
             <w:r>
               <w:rPr>
                 <w:rStyle w:val="Hipervnculo"/>
@@ -955,7 +955,7 @@
               <w:rPr>
                 <w:noProof/>
               </w:rPr>
-              <w:instrText xml:space="preserve"> PAGEREF _Toc240535230 \h </w:instrText>
+              <w:instrText xml:space="preserve"> PAGEREF _Toc240607999 \h </w:instrText>
             </w:r>
             <w:r>
               <w:rPr>
@@ -997,7 +997,7 @@
               <w14:ligatures w14:val="standardContextual"/>
             </w:rPr>
           </w:pPr>
-          <w:hyperlink w:anchor="_Toc240535231" w:history="1">
+          <w:hyperlink w:anchor="_Toc240608000" w:history="1">
             <w:r>
               <w:rPr>
                 <w:rStyle w:val="Hipervnculo"/>
@@ -1021,7 +1021,7 @@
               <w:rPr>
                 <w:noProof/>
               </w:rPr>
-              <w:instrText xml:space="preserve"> PAGEREF _Toc240535231 \h </w:instrText>
+              <w:instrText xml:space="preserve"> PAGEREF _Toc240608000 \h </w:instrText>
             </w:r>
             <w:r>
               <w:rPr>
@@ -1038,7 +1038,7 @@
               <w:rPr>
                 <w:noProof/>
               </w:rPr>
-              <w:t>7</w:t>
+              <w:t>8</w:t>
             </w:r>
             <w:r>
               <w:rPr>
@@ -1063,7 +1063,7 @@
               <w14:ligatures w14:val="standardContextual"/>
             </w:rPr>
           </w:pPr>
-          <w:hyperlink w:anchor="_Toc240535232" w:history="1">
+          <w:hyperlink w:anchor="_Toc240608001" w:history="1">
             <w:r>
               <w:rPr>
                 <w:rStyle w:val="Hipervnculo"/>
@@ -1087,7 +1087,7 @@
               <w:rPr>
                 <w:noProof/>
               </w:rPr>
-              <w:instrText xml:space="preserve"> PAGEREF _Toc240535232 \h </w:instrText>
+              <w:instrText xml:space="preserve"> PAGEREF _Toc240608001 \h </w:instrText>
             </w:r>
             <w:r>
               <w:rPr>
@@ -1129,7 +1129,7 @@
               <w14:ligatures w14:val="standardContextual"/>
             </w:rPr>
           </w:pPr>
-          <w:hyperlink w:anchor="_Toc240535233" w:history="1">
+          <w:hyperlink w:anchor="_Toc240608002" w:history="1">
             <w:r>
               <w:rPr>
                 <w:rStyle w:val="Hipervnculo"/>
@@ -1153,7 +1153,7 @@
               <w:rPr>
                 <w:noProof/>
               </w:rPr>
-              <w:instrText xml:space="preserve"> PAGEREF _Toc240535233 \h </w:instrText>
+              <w:instrText xml:space="preserve"> PAGEREF _Toc240608002 \h </w:instrText>
             </w:r>
             <w:r>
               <w:rPr>
@@ -1170,7 +1170,7 @@
               <w:rPr>
                 <w:noProof/>
               </w:rPr>
-              <w:t>8</w:t>
+              <w:t>9</w:t>
             </w:r>
             <w:r>
               <w:rPr>
@@ -1195,7 +1195,7 @@
               <w14:ligatures w14:val="standardContextual"/>
             </w:rPr>
           </w:pPr>
-          <w:hyperlink w:anchor="_Toc240535234" w:history="1">
+          <w:hyperlink w:anchor="_Toc240608003" w:history="1">
             <w:r>
               <w:rPr>
                 <w:rStyle w:val="Hipervnculo"/>
@@ -1219,7 +1219,7 @@
               <w:rPr>
                 <w:noProof/>
               </w:rPr>
-              <w:instrText xml:space="preserve"> PAGEREF _Toc240535234 \h </w:instrText>
+              <w:instrText xml:space="preserve"> PAGEREF _Toc240608003 \h </w:instrText>
             </w:r>
             <w:r>
               <w:rPr>
@@ -1262,7 +1262,7 @@
       <w:pPr>
         <w:pStyle w:val="Ttulo1"/>
       </w:pPr>
-      <w:bookmarkStart w:id="0" w:name="_Toc240535221"/>
+      <w:bookmarkStart w:id="0" w:name="_Toc240607990"/>
       <w:r>
         <w:t>1. INTRODUCCIÓN</w:t>
       </w:r>
@@ -1299,7 +1299,7 @@
       <w:pPr>
         <w:pStyle w:val="Ttulo1"/>
       </w:pPr>
-      <w:bookmarkStart w:id="1" w:name="_Toc240535222"/>
+      <w:bookmarkStart w:id="1" w:name="_Toc240607991"/>
       <w:r>
         <w:t>2. ARQUITECTURA DE LA SOLUCIÓN</w:t>
       </w:r>
@@ -1309,7 +1309,7 @@
       <w:pPr>
         <w:pStyle w:val="Ttulo2"/>
       </w:pPr>
-      <w:bookmarkStart w:id="2" w:name="_Toc240535223"/>
+      <w:bookmarkStart w:id="2" w:name="_Toc240607992"/>
       <w:r>
         <w:t>2.1 Un único artefacto</w:t>
       </w:r>
@@ -1337,7 +1337,7 @@
       <w:pPr>
         <w:pStyle w:val="Ttulo2"/>
       </w:pPr>
-      <w:bookmarkStart w:id="3" w:name="_Toc240535224"/>
+      <w:bookmarkStart w:id="3" w:name="_Toc240607993"/>
       <w:r>
         <w:t>2.2 Carga única al arrancar</w:t>
       </w:r>
@@ -1356,7 +1356,7 @@
       <w:pPr>
         <w:pStyle w:val="Ttulo2"/>
       </w:pPr>
-      <w:bookmarkStart w:id="4" w:name="_Toc240535225"/>
+      <w:bookmarkStart w:id="4" w:name="_Toc240607994"/>
       <w:r>
         <w:t>2.3 Las dos direcciones del servicio</w:t>
       </w:r>
@@ -1731,10 +1731,10 @@
           <w:noProof/>
         </w:rPr>
         <w:drawing>
-          <wp:inline distT="0" distB="0" distL="0" distR="0" wp14:anchorId="326B685A" wp14:editId="5D8F1A7D">
+          <wp:inline distT="0" distB="0" distL="0" distR="0" wp14:anchorId="11122092" wp14:editId="7F783E8D">
             <wp:extent cx="5391150" cy="3076575"/>
             <wp:effectExtent l="0" t="0" r="0" b="0"/>
-            <wp:docPr id="217892708" name="Imagen 217892708"/>
+            <wp:docPr id="255006214" name="Imagen 255006214"/>
             <wp:cNvGraphicFramePr>
               <a:graphicFrameLocks xmlns:a="http://schemas.openxmlformats.org/drawingml/2006/main" noChangeAspect="1"/>
             </wp:cNvGraphicFramePr>
@@ -1789,7 +1789,7 @@
       <w:pPr>
         <w:pStyle w:val="Ttulo1"/>
       </w:pPr>
-      <w:bookmarkStart w:id="5" w:name="_Toc240535226"/>
+      <w:bookmarkStart w:id="5" w:name="_Toc240607995"/>
       <w:r>
         <w:t>3. CONTRATO DE ENTRADA Y SALIDA</w:t>
       </w:r>
@@ -1799,7 +1799,7 @@
       <w:pPr>
         <w:pStyle w:val="Ttulo2"/>
       </w:pPr>
-      <w:bookmarkStart w:id="6" w:name="_Toc240535227"/>
+      <w:bookmarkStart w:id="6" w:name="_Toc240607996"/>
       <w:r>
         <w:t>3.1 Entrada</w:t>
       </w:r>
@@ -2319,10 +2319,10 @@
           <w:noProof/>
         </w:rPr>
         <w:drawing>
-          <wp:inline distT="0" distB="0" distL="0" distR="0" wp14:anchorId="55F8066D" wp14:editId="271B5559">
+          <wp:inline distT="0" distB="0" distL="0" distR="0" wp14:anchorId="4304AC4C" wp14:editId="2552A9DE">
             <wp:extent cx="5391150" cy="2952750"/>
             <wp:effectExtent l="0" t="0" r="0" b="0"/>
-            <wp:docPr id="2004684727" name="Imagen 2004684727"/>
+            <wp:docPr id="598070082" name="Imagen 598070082"/>
             <wp:cNvGraphicFramePr>
               <a:graphicFrameLocks xmlns:a="http://schemas.openxmlformats.org/drawingml/2006/main" noChangeAspect="1"/>
             </wp:cNvGraphicFramePr>
@@ -2377,7 +2377,7 @@
       <w:pPr>
         <w:pStyle w:val="Ttulo2"/>
       </w:pPr>
-      <w:bookmarkStart w:id="7" w:name="_Toc240535228"/>
+      <w:bookmarkStart w:id="7" w:name="_Toc240607997"/>
       <w:r>
         <w:t>3.2 Salida</w:t>
       </w:r>
@@ -2405,7 +2405,7 @@
       <w:pPr>
         <w:pStyle w:val="Ttulo1"/>
       </w:pPr>
-      <w:bookmarkStart w:id="8" w:name="_Toc240535229"/>
+      <w:bookmarkStart w:id="8" w:name="_Toc240607998"/>
       <w:r>
         <w:t>4. PRUEBA CON TRES EMPLEADOS</w:t>
       </w:r>
@@ -2948,10 +2948,10 @@
           <w:noProof/>
         </w:rPr>
         <w:drawing>
-          <wp:inline distT="0" distB="0" distL="0" distR="0" wp14:anchorId="5EA5F153" wp14:editId="1F27ED9F">
+          <wp:inline distT="0" distB="0" distL="0" distR="0" wp14:anchorId="6F4B5D59" wp14:editId="394905E9">
             <wp:extent cx="5391150" cy="2152650"/>
             <wp:effectExtent l="0" t="0" r="0" b="0"/>
-            <wp:docPr id="288753694" name="Imagen 288753694"/>
+            <wp:docPr id="860443427" name="Imagen 860443427"/>
             <wp:cNvGraphicFramePr>
               <a:graphicFrameLocks xmlns:a="http://schemas.openxmlformats.org/drawingml/2006/main" noChangeAspect="1"/>
             </wp:cNvGraphicFramePr>
@@ -3015,7 +3015,7 @@
       <w:pPr>
         <w:pStyle w:val="Ttulo1"/>
       </w:pPr>
-      <w:bookmarkStart w:id="9" w:name="_Toc240535230"/>
+      <w:bookmarkStart w:id="9" w:name="_Toc240607999"/>
       <w:r>
         <w:t>5. VALIDACIÓN DE LAS ENTRADAS</w:t>
       </w:r>
@@ -3036,14 +3036,17 @@
         <w:jc w:val="both"/>
       </w:pPr>
       <w:r>
-        <w:t>Como prueba, se envió el empleado estable con el campo de horas extra en "quizás", un valor que no existe en el dataset. La respuesta fue el código 422 con el mensaje "Input should be 'No' or 'Yes'" y el nombre del campo afectado. Sin esta barrera, la codificación de variables dejaría pasar el valor desconocido como si fueran todas las categorías en cero y el modelo devolvería una probabilidad silenciosamente incorrecta: el error es preferible a una respuesta equivocada.</w:t>
+        <w:t xml:space="preserve">Como prueba, se envió el empleado estable con el campo de horas extra en "quizás", un valor que no existe en el dataset. El servicio respondió con el código 422, el nombre del campo afectado y la indicación de que ese campo solo admite los valores No o Yes. El mensaje lo redacta la herramienta en inglés ("Input should be 'No' or 'Yes'"), igual que los nombres de las columnas, que se conservaron tal como vienen en el archivo original del dataset para no introducir errores de traducción. Sin esta barrera, la </w:t>
+      </w:r>
+      <w:r>
+        <w:t>codificación de variables dejaría pasar el valor desconocido como si fueran todas las categorías en cero y el modelo devolvería una probabilidad silenciosamente incorrecta: el error es preferible a una respuesta equivocada.</w:t>
       </w:r>
     </w:p>
     <w:p>
       <w:pPr>
         <w:pStyle w:val="Ttulo1"/>
       </w:pPr>
-      <w:bookmarkStart w:id="10" w:name="_Toc240535231"/>
+      <w:bookmarkStart w:id="10" w:name="_Toc240608000"/>
       <w:r>
         <w:t>6. EJECUCIÓN Y DEMOSTRACIÓN</w:t>
       </w:r>
@@ -3080,7 +3083,7 @@
       <w:pPr>
         <w:pStyle w:val="Ttulo1"/>
       </w:pPr>
-      <w:bookmarkStart w:id="11" w:name="_Toc240535232"/>
+      <w:bookmarkStart w:id="11" w:name="_Toc240608001"/>
       <w:r>
         <w:t>7. CONCLUSIONES</w:t>
       </w:r>
@@ -3468,7 +3471,7 @@
       <w:pPr>
         <w:pStyle w:val="Ttulo1"/>
       </w:pPr>
-      <w:bookmarkStart w:id="12" w:name="_Toc240535233"/>
+      <w:bookmarkStart w:id="12" w:name="_Toc240608002"/>
       <w:r>
         <w:t>8. LINK COLAB</w:t>
       </w:r>
@@ -3501,7 +3504,7 @@
       <w:pPr>
         <w:pStyle w:val="Ttulo1"/>
       </w:pPr>
-      <w:bookmarkStart w:id="13" w:name="_Toc240535234"/>
+      <w:bookmarkStart w:id="13" w:name="_Toc240608003"/>
       <w:r>
         <w:t>9. REFERENCIAS</w:t>
       </w:r>
@@ -3649,10 +3652,10 @@
 <file path=word/numbering.xml><?xml version="1.0" encoding="utf-8"?>
 <w:numbering xmlns:wpc="http://schemas.microsoft.com/office/word/2010/wordprocessingCanvas" xmlns:cx="http://schemas.microsoft.com/office/drawing/2014/chartex" xmlns:cx1="http://schemas.microsoft.com/office/drawing/2015/9/8/chartex" xmlns:cx2="http://schemas.microsoft.com/office/drawing/2015/10/21/chartex" xmlns:cx3="http://schemas.microsoft.com/office/drawing/2016/5/9/chartex" xmlns:cx4="http://schemas.microsoft.com/office/drawing/2016/5/10/chartex" xmlns:cx5="http://schemas.microsoft.com/office/drawing/2016/5/11/chartex" xmlns:cx6="http://schemas.microsoft.com/office/drawing/2016/5/12/chartex" xmlns:cx7="http://schemas.microsoft.com/office/drawing/2016/5/13/chartex" xmlns:cx8="http://schemas.microsoft.com/office/drawing/2016/5/14/chartex" xmlns:mc="http://schemas.openxmlformats.org/markup-compatibility/2006" xmlns:aink="http://schemas.microsoft.com/office/drawing/2016/ink" xmlns:am3d="http://schemas.microsoft.com/office/drawing/2017/model3d" xmlns:o="urn:schemas-microsoft-com:office:office" xmlns:oel="http://schemas.microsoft.com/office/2019/extlst" xmlns:r="http://schemas.openxmlformats.org/officeDocument/2006/relationships" xmlns:m="http://schemas.openxmlformats.org/officeDocument/2006/math" xmlns:v="urn:schemas-microsoft-com:vml" xmlns:wp14="http://schemas.microsoft.com/office/word/2010/wordprocessingDrawing" xmlns:wp="http://schemas.openxmlformats.org/drawingml/2006/wordprocessingDrawing" xmlns:w10="urn:schemas-microsoft-com:office:word" xmlns:w="http://schemas.openxmlformats.org/wordprocessingml/2006/main" xmlns:w14="http://schemas.microsoft.com/office/word/2010/wordml" xmlns:w15="http://schemas.microsoft.com/office/word/2012/wordml" xmlns:w16cex="http://schemas.microsoft.com/office/word/2018/wordml/cex" xmlns:w16cid="http://schemas.microsoft.com/office/word/2016/wordml/cid" xmlns:w16="http://schemas.microsoft.com/office/word/2018/wordml" xmlns:w16du="http://schemas.microsoft.com/office/word/2023/wordml/word16du" xmlns:w16sdtdh="http://schemas.microsoft.com/office/word/2020/wordml/sdtdatahash" xmlns:w16sdtfl="http://schemas.microsoft.com/office/word/2024/wordml/sdtformatlock" xmlns:w16se="http://schemas.microsoft.com/office/word/2015/wordml/symex" xmlns:wpg="http://schemas.microsoft.com/office/word/2010/wordprocessingGroup" xmlns:wpi="http://schemas.microsoft.com/office/word/2010/wordprocessingInk" xmlns:wne="http://schemas.microsoft.com/office/word/2006/wordml" xmlns:wps="http://schemas.microsoft.com/office/word/2010/wordprocessingShape" mc:Ignorable="w14 w15 w16se w16cid w16 w16cex w16sdtdh w16sdtfl w16du wp14">
   <w:abstractNum w:abstractNumId="0" w15:restartNumberingAfterBreak="0">
-    <w:nsid w:val="350961DD"/>
+    <w:nsid w:val="3151403E"/>
     <w:multiLevelType w:val="hybridMultilevel"/>
-    <w:tmpl w:val="4F42149C"/>
-    <w:lvl w:ilvl="0" w:tplc="FFDC35F0">
+    <w:tmpl w:val="24CAA65A"/>
+    <w:lvl w:ilvl="0" w:tplc="44888330">
       <w:start w:val="1"/>
       <w:numFmt w:val="bullet"/>
       <w:lvlText w:val="●"/>
@@ -3661,7 +3664,7 @@
         <w:ind w:left="720" w:hanging="360"/>
       </w:pPr>
     </w:lvl>
-    <w:lvl w:ilvl="1" w:tplc="8E5A7F4A">
+    <w:lvl w:ilvl="1" w:tplc="369C5F92">
       <w:start w:val="1"/>
       <w:numFmt w:val="bullet"/>
       <w:lvlText w:val="○"/>
@@ -3670,7 +3673,7 @@
         <w:ind w:left="1440" w:hanging="360"/>
       </w:pPr>
     </w:lvl>
-    <w:lvl w:ilvl="2" w:tplc="B532B782">
+    <w:lvl w:ilvl="2" w:tplc="CE6EFFAC">
       <w:start w:val="1"/>
       <w:numFmt w:val="bullet"/>
       <w:lvlText w:val="■"/>
@@ -3679,7 +3682,7 @@
         <w:ind w:left="2160" w:hanging="360"/>
       </w:pPr>
     </w:lvl>
-    <w:lvl w:ilvl="3" w:tplc="8E887F2A">
+    <w:lvl w:ilvl="3" w:tplc="F2DA4810">
       <w:start w:val="1"/>
       <w:numFmt w:val="bullet"/>
       <w:lvlText w:val="●"/>
@@ -3688,7 +3691,7 @@
         <w:ind w:left="2880" w:hanging="360"/>
       </w:pPr>
     </w:lvl>
-    <w:lvl w:ilvl="4" w:tplc="CBD8D98C">
+    <w:lvl w:ilvl="4" w:tplc="1C02FA7A">
       <w:start w:val="1"/>
       <w:numFmt w:val="bullet"/>
       <w:lvlText w:val="○"/>
@@ -3697,7 +3700,7 @@
         <w:ind w:left="3600" w:hanging="360"/>
       </w:pPr>
     </w:lvl>
-    <w:lvl w:ilvl="5" w:tplc="85F6D8AA">
+    <w:lvl w:ilvl="5" w:tplc="CA3ACA70">
       <w:start w:val="1"/>
       <w:numFmt w:val="bullet"/>
       <w:lvlText w:val="■"/>
@@ -3706,7 +3709,7 @@
         <w:ind w:left="4320" w:hanging="360"/>
       </w:pPr>
     </w:lvl>
-    <w:lvl w:ilvl="6" w:tplc="8AF8DACA">
+    <w:lvl w:ilvl="6" w:tplc="D0F6F1C8">
       <w:start w:val="1"/>
       <w:numFmt w:val="bullet"/>
       <w:lvlText w:val="●"/>
@@ -3715,7 +3718,7 @@
         <w:ind w:left="5040" w:hanging="360"/>
       </w:pPr>
     </w:lvl>
-    <w:lvl w:ilvl="7" w:tplc="352E9724">
+    <w:lvl w:ilvl="7" w:tplc="4C6419C8">
       <w:start w:val="1"/>
       <w:numFmt w:val="bullet"/>
       <w:lvlText w:val="●"/>
@@ -3724,7 +3727,7 @@
         <w:ind w:left="5760" w:hanging="360"/>
       </w:pPr>
     </w:lvl>
-    <w:lvl w:ilvl="8" w:tplc="C9E26790">
+    <w:lvl w:ilvl="8" w:tplc="527E0C92">
       <w:start w:val="1"/>
       <w:numFmt w:val="bullet"/>
       <w:lvlText w:val="●"/>
@@ -3735,10 +3738,10 @@
     </w:lvl>
   </w:abstractNum>
   <w:abstractNum w:abstractNumId="1" w15:restartNumberingAfterBreak="0">
-    <w:nsid w:val="79EF0B5A"/>
+    <w:nsid w:val="50FB6615"/>
     <w:multiLevelType w:val="hybridMultilevel"/>
-    <w:tmpl w:val="6BEEE4CC"/>
-    <w:lvl w:ilvl="0" w:tplc="2BB674AC">
+    <w:tmpl w:val="E1B2FF4C"/>
+    <w:lvl w:ilvl="0" w:tplc="A1083D20">
       <w:start w:val="1"/>
       <w:numFmt w:val="bullet"/>
       <w:lvlText w:val="•"/>
@@ -3747,54 +3750,54 @@
         <w:ind w:left="720" w:hanging="360"/>
       </w:pPr>
     </w:lvl>
-    <w:lvl w:ilvl="1" w:tplc="4864863C">
+    <w:lvl w:ilvl="1" w:tplc="6F94EFA6">
       <w:numFmt w:val="decimal"/>
       <w:lvlText w:val=""/>
       <w:lvlJc w:val="left"/>
     </w:lvl>
-    <w:lvl w:ilvl="2" w:tplc="1FC07D6C">
+    <w:lvl w:ilvl="2" w:tplc="372E2F14">
       <w:numFmt w:val="decimal"/>
       <w:lvlText w:val=""/>
       <w:lvlJc w:val="left"/>
     </w:lvl>
-    <w:lvl w:ilvl="3" w:tplc="37D8C88E">
+    <w:lvl w:ilvl="3" w:tplc="6608A33E">
       <w:numFmt w:val="decimal"/>
       <w:lvlText w:val=""/>
       <w:lvlJc w:val="left"/>
     </w:lvl>
-    <w:lvl w:ilvl="4" w:tplc="904094B4">
+    <w:lvl w:ilvl="4" w:tplc="0EF88E2A">
       <w:numFmt w:val="decimal"/>
       <w:lvlText w:val=""/>
       <w:lvlJc w:val="left"/>
     </w:lvl>
-    <w:lvl w:ilvl="5" w:tplc="2B40ABE0">
+    <w:lvl w:ilvl="5" w:tplc="7CB239EA">
       <w:numFmt w:val="decimal"/>
       <w:lvlText w:val=""/>
       <w:lvlJc w:val="left"/>
     </w:lvl>
-    <w:lvl w:ilvl="6" w:tplc="2A02D9FA">
+    <w:lvl w:ilvl="6" w:tplc="2EE6A680">
       <w:numFmt w:val="decimal"/>
       <w:lvlText w:val=""/>
       <w:lvlJc w:val="left"/>
     </w:lvl>
-    <w:lvl w:ilvl="7" w:tplc="F5A45030">
+    <w:lvl w:ilvl="7" w:tplc="EF18F8F8">
       <w:numFmt w:val="decimal"/>
       <w:lvlText w:val=""/>
       <w:lvlJc w:val="left"/>
     </w:lvl>
-    <w:lvl w:ilvl="8" w:tplc="B4548D90">
+    <w:lvl w:ilvl="8" w:tplc="E342DC04">
       <w:numFmt w:val="decimal"/>
       <w:lvlText w:val=""/>
       <w:lvlJc w:val="left"/>
     </w:lvl>
   </w:abstractNum>
-  <w:num w:numId="1" w16cid:durableId="359092143">
+  <w:num w:numId="1" w16cid:durableId="903681796">
     <w:abstractNumId w:val="0"/>
     <w:lvlOverride w:ilvl="0">
       <w:startOverride w:val="1"/>
     </w:lvlOverride>
   </w:num>
-  <w:num w:numId="2" w16cid:durableId="1045057036">
+  <w:num w:numId="2" w16cid:durableId="294070216">
     <w:abstractNumId w:val="1"/>
     <w:lvlOverride w:ilvl="0">
       <w:startOverride w:val="1"/>
@@ -4415,7 +4418,7 @@
     <w:autoRedefine/>
     <w:uiPriority w:val="39"/>
     <w:unhideWhenUsed/>
-    <w:rsid w:val="00110C18"/>
+    <w:rsid w:val="00AF388C"/>
     <w:pPr>
       <w:spacing w:after="100"/>
     </w:pPr>
@@ -4427,7 +4430,7 @@
     <w:autoRedefine/>
     <w:uiPriority w:val="39"/>
     <w:unhideWhenUsed/>
-    <w:rsid w:val="00110C18"/>
+    <w:rsid w:val="00AF388C"/>
     <w:pPr>
       <w:spacing w:after="100"/>
       <w:ind w:left="220"/>

</xml_diff>

<commit_message>
Entrega 3: lanzador espera a que la API este lista; informe mas breve
Co-Authored-By: Claude Opus 5 <noreply@anthropic.com>
</commit_message>
<xml_diff>
--- a/entregas/Entrega3_RAFFO.docx
+++ b/entregas/Entrega3_RAFFO.docx
@@ -12,7 +12,7 @@
           <w:noProof/>
         </w:rPr>
         <w:drawing>
-          <wp:inline distT="0" distB="0" distL="0" distR="0" wp14:anchorId="639EAD23" wp14:editId="5964F4D9">
+          <wp:inline distT="0" distB="0" distL="0" distR="0" wp14:anchorId="16CE1BCD" wp14:editId="7C0D5000">
             <wp:extent cx="1466850" cy="314325"/>
             <wp:effectExtent l="0" t="0" r="0" b="0"/>
             <wp:docPr id="1" name="Imagen 1"/>
@@ -309,7 +309,7 @@
     <w:sdt>
       <w:sdtPr>
         <w:alias w:val="Índice"/>
-        <w:id w:val="-2116128396"/>
+        <w:id w:val="-1125763249"/>
       </w:sdtPr>
       <w:sdtEndPr/>
       <w:sdtContent>
@@ -337,7 +337,7 @@
           <w:r>
             <w:fldChar w:fldCharType="separate"/>
           </w:r>
-          <w:hyperlink w:anchor="_Toc240607990" w:history="1">
+          <w:hyperlink w:anchor="_Toc240608727" w:history="1">
             <w:r>
               <w:rPr>
                 <w:rStyle w:val="Hipervnculo"/>
@@ -361,7 +361,7 @@
               <w:rPr>
                 <w:noProof/>
               </w:rPr>
-              <w:instrText xml:space="preserve"> PAGEREF _Toc240607990 \h </w:instrText>
+              <w:instrText xml:space="preserve"> PAGEREF _Toc240608727 \h </w:instrText>
             </w:r>
             <w:r>
               <w:rPr>
@@ -403,7 +403,7 @@
               <w14:ligatures w14:val="standardContextual"/>
             </w:rPr>
           </w:pPr>
-          <w:hyperlink w:anchor="_Toc240607991" w:history="1">
+          <w:hyperlink w:anchor="_Toc240608728" w:history="1">
             <w:r>
               <w:rPr>
                 <w:rStyle w:val="Hipervnculo"/>
@@ -427,7 +427,7 @@
               <w:rPr>
                 <w:noProof/>
               </w:rPr>
-              <w:instrText xml:space="preserve"> PAGEREF _Toc240607991 \h </w:instrText>
+              <w:instrText xml:space="preserve"> PAGEREF _Toc240608728 \h </w:instrText>
             </w:r>
             <w:r>
               <w:rPr>
@@ -469,7 +469,7 @@
               <w14:ligatures w14:val="standardContextual"/>
             </w:rPr>
           </w:pPr>
-          <w:hyperlink w:anchor="_Toc240607992" w:history="1">
+          <w:hyperlink w:anchor="_Toc240608729" w:history="1">
             <w:r>
               <w:rPr>
                 <w:rStyle w:val="Hipervnculo"/>
@@ -493,7 +493,7 @@
               <w:rPr>
                 <w:noProof/>
               </w:rPr>
-              <w:instrText xml:space="preserve"> PAGEREF _Toc240607992 \h </w:instrText>
+              <w:instrText xml:space="preserve"> PAGEREF _Toc240608729 \h </w:instrText>
             </w:r>
             <w:r>
               <w:rPr>
@@ -535,7 +535,7 @@
               <w14:ligatures w14:val="standardContextual"/>
             </w:rPr>
           </w:pPr>
-          <w:hyperlink w:anchor="_Toc240607993" w:history="1">
+          <w:hyperlink w:anchor="_Toc240608730" w:history="1">
             <w:r>
               <w:rPr>
                 <w:rStyle w:val="Hipervnculo"/>
@@ -559,7 +559,7 @@
               <w:rPr>
                 <w:noProof/>
               </w:rPr>
-              <w:instrText xml:space="preserve"> PAGEREF _Toc240607993 \h </w:instrText>
+              <w:instrText xml:space="preserve"> PAGEREF _Toc240608730 \h </w:instrText>
             </w:r>
             <w:r>
               <w:rPr>
@@ -601,7 +601,7 @@
               <w14:ligatures w14:val="standardContextual"/>
             </w:rPr>
           </w:pPr>
-          <w:hyperlink w:anchor="_Toc240607994" w:history="1">
+          <w:hyperlink w:anchor="_Toc240608731" w:history="1">
             <w:r>
               <w:rPr>
                 <w:rStyle w:val="Hipervnculo"/>
@@ -625,7 +625,7 @@
               <w:rPr>
                 <w:noProof/>
               </w:rPr>
-              <w:instrText xml:space="preserve"> PAGEREF _Toc240607994 \h </w:instrText>
+              <w:instrText xml:space="preserve"> PAGEREF _Toc240608731 \h </w:instrText>
             </w:r>
             <w:r>
               <w:rPr>
@@ -667,7 +667,7 @@
               <w14:ligatures w14:val="standardContextual"/>
             </w:rPr>
           </w:pPr>
-          <w:hyperlink w:anchor="_Toc240607995" w:history="1">
+          <w:hyperlink w:anchor="_Toc240608732" w:history="1">
             <w:r>
               <w:rPr>
                 <w:rStyle w:val="Hipervnculo"/>
@@ -691,7 +691,7 @@
               <w:rPr>
                 <w:noProof/>
               </w:rPr>
-              <w:instrText xml:space="preserve"> PAGEREF _Toc240607995 \h </w:instrText>
+              <w:instrText xml:space="preserve"> PAGEREF _Toc240608732 \h </w:instrText>
             </w:r>
             <w:r>
               <w:rPr>
@@ -733,7 +733,7 @@
               <w14:ligatures w14:val="standardContextual"/>
             </w:rPr>
           </w:pPr>
-          <w:hyperlink w:anchor="_Toc240607996" w:history="1">
+          <w:hyperlink w:anchor="_Toc240608733" w:history="1">
             <w:r>
               <w:rPr>
                 <w:rStyle w:val="Hipervnculo"/>
@@ -757,7 +757,7 @@
               <w:rPr>
                 <w:noProof/>
               </w:rPr>
-              <w:instrText xml:space="preserve"> PAGEREF _Toc240607996 \h </w:instrText>
+              <w:instrText xml:space="preserve"> PAGEREF _Toc240608733 \h </w:instrText>
             </w:r>
             <w:r>
               <w:rPr>
@@ -799,7 +799,7 @@
               <w14:ligatures w14:val="standardContextual"/>
             </w:rPr>
           </w:pPr>
-          <w:hyperlink w:anchor="_Toc240607997" w:history="1">
+          <w:hyperlink w:anchor="_Toc240608734" w:history="1">
             <w:r>
               <w:rPr>
                 <w:rStyle w:val="Hipervnculo"/>
@@ -823,7 +823,7 @@
               <w:rPr>
                 <w:noProof/>
               </w:rPr>
-              <w:instrText xml:space="preserve"> PAGEREF _Toc240607997 \h </w:instrText>
+              <w:instrText xml:space="preserve"> PAGEREF _Toc240608734 \h </w:instrText>
             </w:r>
             <w:r>
               <w:rPr>
@@ -865,7 +865,7 @@
               <w14:ligatures w14:val="standardContextual"/>
             </w:rPr>
           </w:pPr>
-          <w:hyperlink w:anchor="_Toc240607998" w:history="1">
+          <w:hyperlink w:anchor="_Toc240608735" w:history="1">
             <w:r>
               <w:rPr>
                 <w:rStyle w:val="Hipervnculo"/>
@@ -889,7 +889,7 @@
               <w:rPr>
                 <w:noProof/>
               </w:rPr>
-              <w:instrText xml:space="preserve"> PAGEREF _Toc240607998 \h </w:instrText>
+              <w:instrText xml:space="preserve"> PAGEREF _Toc240608735 \h </w:instrText>
             </w:r>
             <w:r>
               <w:rPr>
@@ -931,7 +931,7 @@
               <w14:ligatures w14:val="standardContextual"/>
             </w:rPr>
           </w:pPr>
-          <w:hyperlink w:anchor="_Toc240607999" w:history="1">
+          <w:hyperlink w:anchor="_Toc240608736" w:history="1">
             <w:r>
               <w:rPr>
                 <w:rStyle w:val="Hipervnculo"/>
@@ -955,7 +955,7 @@
               <w:rPr>
                 <w:noProof/>
               </w:rPr>
-              <w:instrText xml:space="preserve"> PAGEREF _Toc240607999 \h </w:instrText>
+              <w:instrText xml:space="preserve"> PAGEREF _Toc240608736 \h </w:instrText>
             </w:r>
             <w:r>
               <w:rPr>
@@ -997,7 +997,7 @@
               <w14:ligatures w14:val="standardContextual"/>
             </w:rPr>
           </w:pPr>
-          <w:hyperlink w:anchor="_Toc240608000" w:history="1">
+          <w:hyperlink w:anchor="_Toc240608737" w:history="1">
             <w:r>
               <w:rPr>
                 <w:rStyle w:val="Hipervnculo"/>
@@ -1021,7 +1021,7 @@
               <w:rPr>
                 <w:noProof/>
               </w:rPr>
-              <w:instrText xml:space="preserve"> PAGEREF _Toc240608000 \h </w:instrText>
+              <w:instrText xml:space="preserve"> PAGEREF _Toc240608737 \h </w:instrText>
             </w:r>
             <w:r>
               <w:rPr>
@@ -1038,7 +1038,7 @@
               <w:rPr>
                 <w:noProof/>
               </w:rPr>
-              <w:t>8</w:t>
+              <w:t>7</w:t>
             </w:r>
             <w:r>
               <w:rPr>
@@ -1063,7 +1063,7 @@
               <w14:ligatures w14:val="standardContextual"/>
             </w:rPr>
           </w:pPr>
-          <w:hyperlink w:anchor="_Toc240608001" w:history="1">
+          <w:hyperlink w:anchor="_Toc240608738" w:history="1">
             <w:r>
               <w:rPr>
                 <w:rStyle w:val="Hipervnculo"/>
@@ -1087,7 +1087,7 @@
               <w:rPr>
                 <w:noProof/>
               </w:rPr>
-              <w:instrText xml:space="preserve"> PAGEREF _Toc240608001 \h </w:instrText>
+              <w:instrText xml:space="preserve"> PAGEREF _Toc240608738 \h </w:instrText>
             </w:r>
             <w:r>
               <w:rPr>
@@ -1129,7 +1129,7 @@
               <w14:ligatures w14:val="standardContextual"/>
             </w:rPr>
           </w:pPr>
-          <w:hyperlink w:anchor="_Toc240608002" w:history="1">
+          <w:hyperlink w:anchor="_Toc240608739" w:history="1">
             <w:r>
               <w:rPr>
                 <w:rStyle w:val="Hipervnculo"/>
@@ -1153,7 +1153,7 @@
               <w:rPr>
                 <w:noProof/>
               </w:rPr>
-              <w:instrText xml:space="preserve"> PAGEREF _Toc240608002 \h </w:instrText>
+              <w:instrText xml:space="preserve"> PAGEREF _Toc240608739 \h </w:instrText>
             </w:r>
             <w:r>
               <w:rPr>
@@ -1170,7 +1170,7 @@
               <w:rPr>
                 <w:noProof/>
               </w:rPr>
-              <w:t>9</w:t>
+              <w:t>8</w:t>
             </w:r>
             <w:r>
               <w:rPr>
@@ -1195,7 +1195,7 @@
               <w14:ligatures w14:val="standardContextual"/>
             </w:rPr>
           </w:pPr>
-          <w:hyperlink w:anchor="_Toc240608003" w:history="1">
+          <w:hyperlink w:anchor="_Toc240608740" w:history="1">
             <w:r>
               <w:rPr>
                 <w:rStyle w:val="Hipervnculo"/>
@@ -1219,7 +1219,7 @@
               <w:rPr>
                 <w:noProof/>
               </w:rPr>
-              <w:instrText xml:space="preserve"> PAGEREF _Toc240608003 \h </w:instrText>
+              <w:instrText xml:space="preserve"> PAGEREF _Toc240608740 \h </w:instrText>
             </w:r>
             <w:r>
               <w:rPr>
@@ -1262,7 +1262,7 @@
       <w:pPr>
         <w:pStyle w:val="Ttulo1"/>
       </w:pPr>
-      <w:bookmarkStart w:id="0" w:name="_Toc240607990"/>
+      <w:bookmarkStart w:id="0" w:name="_Toc240608727"/>
       <w:r>
         <w:t>1. INTRODUCCIÓN</w:t>
       </w:r>
@@ -1299,7 +1299,7 @@
       <w:pPr>
         <w:pStyle w:val="Ttulo1"/>
       </w:pPr>
-      <w:bookmarkStart w:id="1" w:name="_Toc240607991"/>
+      <w:bookmarkStart w:id="1" w:name="_Toc240608728"/>
       <w:r>
         <w:t>2. ARQUITECTURA DE LA SOLUCIÓN</w:t>
       </w:r>
@@ -1309,7 +1309,7 @@
       <w:pPr>
         <w:pStyle w:val="Ttulo2"/>
       </w:pPr>
-      <w:bookmarkStart w:id="2" w:name="_Toc240607992"/>
+      <w:bookmarkStart w:id="2" w:name="_Toc240608729"/>
       <w:r>
         <w:t>2.1 Un único artefacto</w:t>
       </w:r>
@@ -1337,7 +1337,7 @@
       <w:pPr>
         <w:pStyle w:val="Ttulo2"/>
       </w:pPr>
-      <w:bookmarkStart w:id="3" w:name="_Toc240607993"/>
+      <w:bookmarkStart w:id="3" w:name="_Toc240608730"/>
       <w:r>
         <w:t>2.2 Carga única al arrancar</w:t>
       </w:r>
@@ -1356,7 +1356,7 @@
       <w:pPr>
         <w:pStyle w:val="Ttulo2"/>
       </w:pPr>
-      <w:bookmarkStart w:id="4" w:name="_Toc240607994"/>
+      <w:bookmarkStart w:id="4" w:name="_Toc240608731"/>
       <w:r>
         <w:t>2.3 Las dos direcciones del servicio</w:t>
       </w:r>
@@ -1731,10 +1731,10 @@
           <w:noProof/>
         </w:rPr>
         <w:drawing>
-          <wp:inline distT="0" distB="0" distL="0" distR="0" wp14:anchorId="11122092" wp14:editId="7F783E8D">
+          <wp:inline distT="0" distB="0" distL="0" distR="0" wp14:anchorId="25C3099C" wp14:editId="46547805">
             <wp:extent cx="5391150" cy="3076575"/>
             <wp:effectExtent l="0" t="0" r="0" b="0"/>
-            <wp:docPr id="255006214" name="Imagen 255006214"/>
+            <wp:docPr id="1576149216" name="Imagen 1576149216"/>
             <wp:cNvGraphicFramePr>
               <a:graphicFrameLocks xmlns:a="http://schemas.openxmlformats.org/drawingml/2006/main" noChangeAspect="1"/>
             </wp:cNvGraphicFramePr>
@@ -1789,7 +1789,7 @@
       <w:pPr>
         <w:pStyle w:val="Ttulo1"/>
       </w:pPr>
-      <w:bookmarkStart w:id="5" w:name="_Toc240607995"/>
+      <w:bookmarkStart w:id="5" w:name="_Toc240608732"/>
       <w:r>
         <w:t>3. CONTRATO DE ENTRADA Y SALIDA</w:t>
       </w:r>
@@ -1799,7 +1799,7 @@
       <w:pPr>
         <w:pStyle w:val="Ttulo2"/>
       </w:pPr>
-      <w:bookmarkStart w:id="6" w:name="_Toc240607996"/>
+      <w:bookmarkStart w:id="6" w:name="_Toc240608733"/>
       <w:r>
         <w:t>3.1 Entrada</w:t>
       </w:r>
@@ -2319,10 +2319,10 @@
           <w:noProof/>
         </w:rPr>
         <w:drawing>
-          <wp:inline distT="0" distB="0" distL="0" distR="0" wp14:anchorId="4304AC4C" wp14:editId="2552A9DE">
+          <wp:inline distT="0" distB="0" distL="0" distR="0" wp14:anchorId="318D2332" wp14:editId="0E8C04AB">
             <wp:extent cx="5391150" cy="2952750"/>
             <wp:effectExtent l="0" t="0" r="0" b="0"/>
-            <wp:docPr id="598070082" name="Imagen 598070082"/>
+            <wp:docPr id="1789943845" name="Imagen 1789943845"/>
             <wp:cNvGraphicFramePr>
               <a:graphicFrameLocks xmlns:a="http://schemas.openxmlformats.org/drawingml/2006/main" noChangeAspect="1"/>
             </wp:cNvGraphicFramePr>
@@ -2377,7 +2377,7 @@
       <w:pPr>
         <w:pStyle w:val="Ttulo2"/>
       </w:pPr>
-      <w:bookmarkStart w:id="7" w:name="_Toc240607997"/>
+      <w:bookmarkStart w:id="7" w:name="_Toc240608734"/>
       <w:r>
         <w:t>3.2 Salida</w:t>
       </w:r>
@@ -2405,7 +2405,7 @@
       <w:pPr>
         <w:pStyle w:val="Ttulo1"/>
       </w:pPr>
-      <w:bookmarkStart w:id="8" w:name="_Toc240607998"/>
+      <w:bookmarkStart w:id="8" w:name="_Toc240608735"/>
       <w:r>
         <w:t>4. PRUEBA CON TRES EMPLEADOS</w:t>
       </w:r>
@@ -2948,10 +2948,10 @@
           <w:noProof/>
         </w:rPr>
         <w:drawing>
-          <wp:inline distT="0" distB="0" distL="0" distR="0" wp14:anchorId="6F4B5D59" wp14:editId="394905E9">
+          <wp:inline distT="0" distB="0" distL="0" distR="0" wp14:anchorId="2C9BBCE2" wp14:editId="6DA9FCBF">
             <wp:extent cx="5391150" cy="2152650"/>
             <wp:effectExtent l="0" t="0" r="0" b="0"/>
-            <wp:docPr id="860443427" name="Imagen 860443427"/>
+            <wp:docPr id="448449272" name="Imagen 448449272"/>
             <wp:cNvGraphicFramePr>
               <a:graphicFrameLocks xmlns:a="http://schemas.openxmlformats.org/drawingml/2006/main" noChangeAspect="1"/>
             </wp:cNvGraphicFramePr>
@@ -3015,7 +3015,7 @@
       <w:pPr>
         <w:pStyle w:val="Ttulo1"/>
       </w:pPr>
-      <w:bookmarkStart w:id="9" w:name="_Toc240607999"/>
+      <w:bookmarkStart w:id="9" w:name="_Toc240608736"/>
       <w:r>
         <w:t>5. VALIDACIÓN DE LAS ENTRADAS</w:t>
       </w:r>
@@ -3036,17 +3036,14 @@
         <w:jc w:val="both"/>
       </w:pPr>
       <w:r>
-        <w:t xml:space="preserve">Como prueba, se envió el empleado estable con el campo de horas extra en "quizás", un valor que no existe en el dataset. El servicio respondió con el código 422, el nombre del campo afectado y la indicación de que ese campo solo admite los valores No o Yes. El mensaje lo redacta la herramienta en inglés ("Input should be 'No' or 'Yes'"), igual que los nombres de las columnas, que se conservaron tal como vienen en el archivo original del dataset para no introducir errores de traducción. Sin esta barrera, la </w:t>
-      </w:r>
-      <w:r>
-        <w:t>codificación de variables dejaría pasar el valor desconocido como si fueran todas las categorías en cero y el modelo devolvería una probabilidad silenciosamente incorrecta: el error es preferible a una respuesta equivocada.</w:t>
+        <w:t>Como prueba, se envió el empleado estable con el campo de horas extra en "quizás", un valor que no existe en el dataset. El servicio respondió con el código 422, el nombre del campo afectado y la indicación de que solo admite los valores No o Yes. Sin esta barrera, la codificación de variables dejaría pasar el valor desconocido como si fueran todas las categorías en cero y el modelo devolvería una probabilidad silenciosamente incorrecta: el error es preferible a una respuesta equivocada.</w:t>
       </w:r>
     </w:p>
     <w:p>
       <w:pPr>
         <w:pStyle w:val="Ttulo1"/>
       </w:pPr>
-      <w:bookmarkStart w:id="10" w:name="_Toc240608000"/>
+      <w:bookmarkStart w:id="10" w:name="_Toc240608737"/>
       <w:r>
         <w:t>6. EJECUCIÓN Y DEMOSTRACIÓN</w:t>
       </w:r>
@@ -3083,7 +3080,7 @@
       <w:pPr>
         <w:pStyle w:val="Ttulo1"/>
       </w:pPr>
-      <w:bookmarkStart w:id="11" w:name="_Toc240608001"/>
+      <w:bookmarkStart w:id="11" w:name="_Toc240608738"/>
       <w:r>
         <w:t>7. CONCLUSIONES</w:t>
       </w:r>
@@ -3471,7 +3468,7 @@
       <w:pPr>
         <w:pStyle w:val="Ttulo1"/>
       </w:pPr>
-      <w:bookmarkStart w:id="12" w:name="_Toc240608002"/>
+      <w:bookmarkStart w:id="12" w:name="_Toc240608739"/>
       <w:r>
         <w:t>8. LINK COLAB</w:t>
       </w:r>
@@ -3504,7 +3501,7 @@
       <w:pPr>
         <w:pStyle w:val="Ttulo1"/>
       </w:pPr>
-      <w:bookmarkStart w:id="13" w:name="_Toc240608003"/>
+      <w:bookmarkStart w:id="13" w:name="_Toc240608740"/>
       <w:r>
         <w:t>9. REFERENCIAS</w:t>
       </w:r>
@@ -3652,10 +3649,10 @@
 <file path=word/numbering.xml><?xml version="1.0" encoding="utf-8"?>
 <w:numbering xmlns:wpc="http://schemas.microsoft.com/office/word/2010/wordprocessingCanvas" xmlns:cx="http://schemas.microsoft.com/office/drawing/2014/chartex" xmlns:cx1="http://schemas.microsoft.com/office/drawing/2015/9/8/chartex" xmlns:cx2="http://schemas.microsoft.com/office/drawing/2015/10/21/chartex" xmlns:cx3="http://schemas.microsoft.com/office/drawing/2016/5/9/chartex" xmlns:cx4="http://schemas.microsoft.com/office/drawing/2016/5/10/chartex" xmlns:cx5="http://schemas.microsoft.com/office/drawing/2016/5/11/chartex" xmlns:cx6="http://schemas.microsoft.com/office/drawing/2016/5/12/chartex" xmlns:cx7="http://schemas.microsoft.com/office/drawing/2016/5/13/chartex" xmlns:cx8="http://schemas.microsoft.com/office/drawing/2016/5/14/chartex" xmlns:mc="http://schemas.openxmlformats.org/markup-compatibility/2006" xmlns:aink="http://schemas.microsoft.com/office/drawing/2016/ink" xmlns:am3d="http://schemas.microsoft.com/office/drawing/2017/model3d" xmlns:o="urn:schemas-microsoft-com:office:office" xmlns:oel="http://schemas.microsoft.com/office/2019/extlst" xmlns:r="http://schemas.openxmlformats.org/officeDocument/2006/relationships" xmlns:m="http://schemas.openxmlformats.org/officeDocument/2006/math" xmlns:v="urn:schemas-microsoft-com:vml" xmlns:wp14="http://schemas.microsoft.com/office/word/2010/wordprocessingDrawing" xmlns:wp="http://schemas.openxmlformats.org/drawingml/2006/wordprocessingDrawing" xmlns:w10="urn:schemas-microsoft-com:office:word" xmlns:w="http://schemas.openxmlformats.org/wordprocessingml/2006/main" xmlns:w14="http://schemas.microsoft.com/office/word/2010/wordml" xmlns:w15="http://schemas.microsoft.com/office/word/2012/wordml" xmlns:w16cex="http://schemas.microsoft.com/office/word/2018/wordml/cex" xmlns:w16cid="http://schemas.microsoft.com/office/word/2016/wordml/cid" xmlns:w16="http://schemas.microsoft.com/office/word/2018/wordml" xmlns:w16du="http://schemas.microsoft.com/office/word/2023/wordml/word16du" xmlns:w16sdtdh="http://schemas.microsoft.com/office/word/2020/wordml/sdtdatahash" xmlns:w16sdtfl="http://schemas.microsoft.com/office/word/2024/wordml/sdtformatlock" xmlns:w16se="http://schemas.microsoft.com/office/word/2015/wordml/symex" xmlns:wpg="http://schemas.microsoft.com/office/word/2010/wordprocessingGroup" xmlns:wpi="http://schemas.microsoft.com/office/word/2010/wordprocessingInk" xmlns:wne="http://schemas.microsoft.com/office/word/2006/wordml" xmlns:wps="http://schemas.microsoft.com/office/word/2010/wordprocessingShape" mc:Ignorable="w14 w15 w16se w16cid w16 w16cex w16sdtdh w16sdtfl w16du wp14">
   <w:abstractNum w:abstractNumId="0" w15:restartNumberingAfterBreak="0">
-    <w:nsid w:val="3151403E"/>
+    <w:nsid w:val="610002E0"/>
     <w:multiLevelType w:val="hybridMultilevel"/>
-    <w:tmpl w:val="24CAA65A"/>
-    <w:lvl w:ilvl="0" w:tplc="44888330">
+    <w:tmpl w:val="72CC5C12"/>
+    <w:lvl w:ilvl="0" w:tplc="718EF0AC">
       <w:start w:val="1"/>
       <w:numFmt w:val="bullet"/>
       <w:lvlText w:val="●"/>
@@ -3664,7 +3661,7 @@
         <w:ind w:left="720" w:hanging="360"/>
       </w:pPr>
     </w:lvl>
-    <w:lvl w:ilvl="1" w:tplc="369C5F92">
+    <w:lvl w:ilvl="1" w:tplc="8F2887B8">
       <w:start w:val="1"/>
       <w:numFmt w:val="bullet"/>
       <w:lvlText w:val="○"/>
@@ -3673,7 +3670,7 @@
         <w:ind w:left="1440" w:hanging="360"/>
       </w:pPr>
     </w:lvl>
-    <w:lvl w:ilvl="2" w:tplc="CE6EFFAC">
+    <w:lvl w:ilvl="2" w:tplc="2F8A46B6">
       <w:start w:val="1"/>
       <w:numFmt w:val="bullet"/>
       <w:lvlText w:val="■"/>
@@ -3682,7 +3679,7 @@
         <w:ind w:left="2160" w:hanging="360"/>
       </w:pPr>
     </w:lvl>
-    <w:lvl w:ilvl="3" w:tplc="F2DA4810">
+    <w:lvl w:ilvl="3" w:tplc="0770BC0C">
       <w:start w:val="1"/>
       <w:numFmt w:val="bullet"/>
       <w:lvlText w:val="●"/>
@@ -3691,7 +3688,7 @@
         <w:ind w:left="2880" w:hanging="360"/>
       </w:pPr>
     </w:lvl>
-    <w:lvl w:ilvl="4" w:tplc="1C02FA7A">
+    <w:lvl w:ilvl="4" w:tplc="A582081C">
       <w:start w:val="1"/>
       <w:numFmt w:val="bullet"/>
       <w:lvlText w:val="○"/>
@@ -3700,7 +3697,7 @@
         <w:ind w:left="3600" w:hanging="360"/>
       </w:pPr>
     </w:lvl>
-    <w:lvl w:ilvl="5" w:tplc="CA3ACA70">
+    <w:lvl w:ilvl="5" w:tplc="95F45CFC">
       <w:start w:val="1"/>
       <w:numFmt w:val="bullet"/>
       <w:lvlText w:val="■"/>
@@ -3709,7 +3706,7 @@
         <w:ind w:left="4320" w:hanging="360"/>
       </w:pPr>
     </w:lvl>
-    <w:lvl w:ilvl="6" w:tplc="D0F6F1C8">
+    <w:lvl w:ilvl="6" w:tplc="C19036B2">
       <w:start w:val="1"/>
       <w:numFmt w:val="bullet"/>
       <w:lvlText w:val="●"/>
@@ -3718,7 +3715,7 @@
         <w:ind w:left="5040" w:hanging="360"/>
       </w:pPr>
     </w:lvl>
-    <w:lvl w:ilvl="7" w:tplc="4C6419C8">
+    <w:lvl w:ilvl="7" w:tplc="B0485B28">
       <w:start w:val="1"/>
       <w:numFmt w:val="bullet"/>
       <w:lvlText w:val="●"/>
@@ -3727,7 +3724,7 @@
         <w:ind w:left="5760" w:hanging="360"/>
       </w:pPr>
     </w:lvl>
-    <w:lvl w:ilvl="8" w:tplc="527E0C92">
+    <w:lvl w:ilvl="8" w:tplc="7018BDA0">
       <w:start w:val="1"/>
       <w:numFmt w:val="bullet"/>
       <w:lvlText w:val="●"/>
@@ -3738,10 +3735,10 @@
     </w:lvl>
   </w:abstractNum>
   <w:abstractNum w:abstractNumId="1" w15:restartNumberingAfterBreak="0">
-    <w:nsid w:val="50FB6615"/>
+    <w:nsid w:val="6F695E0A"/>
     <w:multiLevelType w:val="hybridMultilevel"/>
-    <w:tmpl w:val="E1B2FF4C"/>
-    <w:lvl w:ilvl="0" w:tplc="A1083D20">
+    <w:tmpl w:val="FD846670"/>
+    <w:lvl w:ilvl="0" w:tplc="42EEFA7E">
       <w:start w:val="1"/>
       <w:numFmt w:val="bullet"/>
       <w:lvlText w:val="•"/>
@@ -3750,54 +3747,54 @@
         <w:ind w:left="720" w:hanging="360"/>
       </w:pPr>
     </w:lvl>
-    <w:lvl w:ilvl="1" w:tplc="6F94EFA6">
+    <w:lvl w:ilvl="1" w:tplc="498A8B36">
       <w:numFmt w:val="decimal"/>
       <w:lvlText w:val=""/>
       <w:lvlJc w:val="left"/>
     </w:lvl>
-    <w:lvl w:ilvl="2" w:tplc="372E2F14">
+    <w:lvl w:ilvl="2" w:tplc="2F623548">
       <w:numFmt w:val="decimal"/>
       <w:lvlText w:val=""/>
       <w:lvlJc w:val="left"/>
     </w:lvl>
-    <w:lvl w:ilvl="3" w:tplc="6608A33E">
+    <w:lvl w:ilvl="3" w:tplc="904AE72E">
       <w:numFmt w:val="decimal"/>
       <w:lvlText w:val=""/>
       <w:lvlJc w:val="left"/>
     </w:lvl>
-    <w:lvl w:ilvl="4" w:tplc="0EF88E2A">
+    <w:lvl w:ilvl="4" w:tplc="97947CB6">
       <w:numFmt w:val="decimal"/>
       <w:lvlText w:val=""/>
       <w:lvlJc w:val="left"/>
     </w:lvl>
-    <w:lvl w:ilvl="5" w:tplc="7CB239EA">
+    <w:lvl w:ilvl="5" w:tplc="F97213E4">
       <w:numFmt w:val="decimal"/>
       <w:lvlText w:val=""/>
       <w:lvlJc w:val="left"/>
     </w:lvl>
-    <w:lvl w:ilvl="6" w:tplc="2EE6A680">
+    <w:lvl w:ilvl="6" w:tplc="6F381FDE">
       <w:numFmt w:val="decimal"/>
       <w:lvlText w:val=""/>
       <w:lvlJc w:val="left"/>
     </w:lvl>
-    <w:lvl w:ilvl="7" w:tplc="EF18F8F8">
+    <w:lvl w:ilvl="7" w:tplc="F34C63DA">
       <w:numFmt w:val="decimal"/>
       <w:lvlText w:val=""/>
       <w:lvlJc w:val="left"/>
     </w:lvl>
-    <w:lvl w:ilvl="8" w:tplc="E342DC04">
+    <w:lvl w:ilvl="8" w:tplc="0D4C7834">
       <w:numFmt w:val="decimal"/>
       <w:lvlText w:val=""/>
       <w:lvlJc w:val="left"/>
     </w:lvl>
   </w:abstractNum>
-  <w:num w:numId="1" w16cid:durableId="903681796">
+  <w:num w:numId="1" w16cid:durableId="1355424682">
     <w:abstractNumId w:val="0"/>
     <w:lvlOverride w:ilvl="0">
       <w:startOverride w:val="1"/>
     </w:lvlOverride>
   </w:num>
-  <w:num w:numId="2" w16cid:durableId="294070216">
+  <w:num w:numId="2" w16cid:durableId="499856063">
     <w:abstractNumId w:val="1"/>
     <w:lvlOverride w:ilvl="0">
       <w:startOverride w:val="1"/>
@@ -4418,7 +4415,7 @@
     <w:autoRedefine/>
     <w:uiPriority w:val="39"/>
     <w:unhideWhenUsed/>
-    <w:rsid w:val="00AF388C"/>
+    <w:rsid w:val="00237716"/>
     <w:pPr>
       <w:spacing w:after="100"/>
     </w:pPr>
@@ -4430,7 +4427,7 @@
     <w:autoRedefine/>
     <w:uiPriority w:val="39"/>
     <w:unhideWhenUsed/>
-    <w:rsid w:val="00AF388C"/>
+    <w:rsid w:val="00237716"/>
     <w:pPr>
       <w:spacing w:after="100"/>
       <w:ind w:left="220"/>

</xml_diff>

<commit_message>
Entrega 3: corrige la referencia al link de Colab y el rango de las escalas
Co-Authored-By: Claude Opus 5 <noreply@anthropic.com>
</commit_message>
<xml_diff>
--- a/entregas/Entrega3_RAFFO.docx
+++ b/entregas/Entrega3_RAFFO.docx
@@ -12,7 +12,7 @@
           <w:noProof/>
         </w:rPr>
         <w:drawing>
-          <wp:inline distT="0" distB="0" distL="0" distR="0" wp14:anchorId="16CE1BCD" wp14:editId="7C0D5000">
+          <wp:inline distT="0" distB="0" distL="0" distR="0" wp14:anchorId="45CB9D0F" wp14:editId="2F551FBE">
             <wp:extent cx="1466850" cy="314325"/>
             <wp:effectExtent l="0" t="0" r="0" b="0"/>
             <wp:docPr id="1" name="Imagen 1"/>
@@ -282,7 +282,7 @@
         <w:t xml:space="preserve">El contrato de entrada está validado campo por campo: las siete variables de texto solo admiten los valores presentes en el dataset y cualquier otro valor se rechaza con un error explícito antes de llegar al modelo. El servicio se probó con tres empleados reales del grupo de examen, elegidos para cubrir los tres casos que Recursos Humanos va a encontrar: riesgo alto, empleado estable y caso de frontera. La documentación interactiva se genera sola y sirve de demostración en el navegador. El cuaderno de esta </w:t>
       </w:r>
       <w:r>
-        <w:t>entrega, que levanta el servicio y lo consulta sin necesidad de instalar nada, puede ejecutarse en Google Colab desde el enlace de la sección 7.</w:t>
+        <w:t>entrega, que levanta el servicio y lo consulta sin necesidad de instalar nada, puede ejecutarse en Google Colab desde el enlace de la sección 8.</w:t>
       </w:r>
     </w:p>
     <w:p>
@@ -309,7 +309,7 @@
     <w:sdt>
       <w:sdtPr>
         <w:alias w:val="Índice"/>
-        <w:id w:val="-1125763249"/>
+        <w:id w:val="-510293070"/>
       </w:sdtPr>
       <w:sdtEndPr/>
       <w:sdtContent>
@@ -337,7 +337,7 @@
           <w:r>
             <w:fldChar w:fldCharType="separate"/>
           </w:r>
-          <w:hyperlink w:anchor="_Toc240608727" w:history="1">
+          <w:hyperlink w:anchor="_Toc240639218" w:history="1">
             <w:r>
               <w:rPr>
                 <w:rStyle w:val="Hipervnculo"/>
@@ -361,7 +361,7 @@
               <w:rPr>
                 <w:noProof/>
               </w:rPr>
-              <w:instrText xml:space="preserve"> PAGEREF _Toc240608727 \h </w:instrText>
+              <w:instrText xml:space="preserve"> PAGEREF _Toc240639218 \h </w:instrText>
             </w:r>
             <w:r>
               <w:rPr>
@@ -403,7 +403,7 @@
               <w14:ligatures w14:val="standardContextual"/>
             </w:rPr>
           </w:pPr>
-          <w:hyperlink w:anchor="_Toc240608728" w:history="1">
+          <w:hyperlink w:anchor="_Toc240639219" w:history="1">
             <w:r>
               <w:rPr>
                 <w:rStyle w:val="Hipervnculo"/>
@@ -427,7 +427,7 @@
               <w:rPr>
                 <w:noProof/>
               </w:rPr>
-              <w:instrText xml:space="preserve"> PAGEREF _Toc240608728 \h </w:instrText>
+              <w:instrText xml:space="preserve"> PAGEREF _Toc240639219 \h </w:instrText>
             </w:r>
             <w:r>
               <w:rPr>
@@ -469,7 +469,7 @@
               <w14:ligatures w14:val="standardContextual"/>
             </w:rPr>
           </w:pPr>
-          <w:hyperlink w:anchor="_Toc240608729" w:history="1">
+          <w:hyperlink w:anchor="_Toc240639220" w:history="1">
             <w:r>
               <w:rPr>
                 <w:rStyle w:val="Hipervnculo"/>
@@ -493,7 +493,7 @@
               <w:rPr>
                 <w:noProof/>
               </w:rPr>
-              <w:instrText xml:space="preserve"> PAGEREF _Toc240608729 \h </w:instrText>
+              <w:instrText xml:space="preserve"> PAGEREF _Toc240639220 \h </w:instrText>
             </w:r>
             <w:r>
               <w:rPr>
@@ -535,7 +535,7 @@
               <w14:ligatures w14:val="standardContextual"/>
             </w:rPr>
           </w:pPr>
-          <w:hyperlink w:anchor="_Toc240608730" w:history="1">
+          <w:hyperlink w:anchor="_Toc240639221" w:history="1">
             <w:r>
               <w:rPr>
                 <w:rStyle w:val="Hipervnculo"/>
@@ -559,7 +559,7 @@
               <w:rPr>
                 <w:noProof/>
               </w:rPr>
-              <w:instrText xml:space="preserve"> PAGEREF _Toc240608730 \h </w:instrText>
+              <w:instrText xml:space="preserve"> PAGEREF _Toc240639221 \h </w:instrText>
             </w:r>
             <w:r>
               <w:rPr>
@@ -601,7 +601,7 @@
               <w14:ligatures w14:val="standardContextual"/>
             </w:rPr>
           </w:pPr>
-          <w:hyperlink w:anchor="_Toc240608731" w:history="1">
+          <w:hyperlink w:anchor="_Toc240639222" w:history="1">
             <w:r>
               <w:rPr>
                 <w:rStyle w:val="Hipervnculo"/>
@@ -625,7 +625,7 @@
               <w:rPr>
                 <w:noProof/>
               </w:rPr>
-              <w:instrText xml:space="preserve"> PAGEREF _Toc240608731 \h </w:instrText>
+              <w:instrText xml:space="preserve"> PAGEREF _Toc240639222 \h </w:instrText>
             </w:r>
             <w:r>
               <w:rPr>
@@ -667,7 +667,7 @@
               <w14:ligatures w14:val="standardContextual"/>
             </w:rPr>
           </w:pPr>
-          <w:hyperlink w:anchor="_Toc240608732" w:history="1">
+          <w:hyperlink w:anchor="_Toc240639223" w:history="1">
             <w:r>
               <w:rPr>
                 <w:rStyle w:val="Hipervnculo"/>
@@ -691,7 +691,7 @@
               <w:rPr>
                 <w:noProof/>
               </w:rPr>
-              <w:instrText xml:space="preserve"> PAGEREF _Toc240608732 \h </w:instrText>
+              <w:instrText xml:space="preserve"> PAGEREF _Toc240639223 \h </w:instrText>
             </w:r>
             <w:r>
               <w:rPr>
@@ -733,7 +733,7 @@
               <w14:ligatures w14:val="standardContextual"/>
             </w:rPr>
           </w:pPr>
-          <w:hyperlink w:anchor="_Toc240608733" w:history="1">
+          <w:hyperlink w:anchor="_Toc240639224" w:history="1">
             <w:r>
               <w:rPr>
                 <w:rStyle w:val="Hipervnculo"/>
@@ -757,7 +757,7 @@
               <w:rPr>
                 <w:noProof/>
               </w:rPr>
-              <w:instrText xml:space="preserve"> PAGEREF _Toc240608733 \h </w:instrText>
+              <w:instrText xml:space="preserve"> PAGEREF _Toc240639224 \h </w:instrText>
             </w:r>
             <w:r>
               <w:rPr>
@@ -799,7 +799,7 @@
               <w14:ligatures w14:val="standardContextual"/>
             </w:rPr>
           </w:pPr>
-          <w:hyperlink w:anchor="_Toc240608734" w:history="1">
+          <w:hyperlink w:anchor="_Toc240639225" w:history="1">
             <w:r>
               <w:rPr>
                 <w:rStyle w:val="Hipervnculo"/>
@@ -823,7 +823,7 @@
               <w:rPr>
                 <w:noProof/>
               </w:rPr>
-              <w:instrText xml:space="preserve"> PAGEREF _Toc240608734 \h </w:instrText>
+              <w:instrText xml:space="preserve"> PAGEREF _Toc240639225 \h </w:instrText>
             </w:r>
             <w:r>
               <w:rPr>
@@ -865,7 +865,7 @@
               <w14:ligatures w14:val="standardContextual"/>
             </w:rPr>
           </w:pPr>
-          <w:hyperlink w:anchor="_Toc240608735" w:history="1">
+          <w:hyperlink w:anchor="_Toc240639226" w:history="1">
             <w:r>
               <w:rPr>
                 <w:rStyle w:val="Hipervnculo"/>
@@ -889,7 +889,7 @@
               <w:rPr>
                 <w:noProof/>
               </w:rPr>
-              <w:instrText xml:space="preserve"> PAGEREF _Toc240608735 \h </w:instrText>
+              <w:instrText xml:space="preserve"> PAGEREF _Toc240639226 \h </w:instrText>
             </w:r>
             <w:r>
               <w:rPr>
@@ -931,7 +931,7 @@
               <w14:ligatures w14:val="standardContextual"/>
             </w:rPr>
           </w:pPr>
-          <w:hyperlink w:anchor="_Toc240608736" w:history="1">
+          <w:hyperlink w:anchor="_Toc240639227" w:history="1">
             <w:r>
               <w:rPr>
                 <w:rStyle w:val="Hipervnculo"/>
@@ -955,7 +955,7 @@
               <w:rPr>
                 <w:noProof/>
               </w:rPr>
-              <w:instrText xml:space="preserve"> PAGEREF _Toc240608736 \h </w:instrText>
+              <w:instrText xml:space="preserve"> PAGEREF _Toc240639227 \h </w:instrText>
             </w:r>
             <w:r>
               <w:rPr>
@@ -997,7 +997,7 @@
               <w14:ligatures w14:val="standardContextual"/>
             </w:rPr>
           </w:pPr>
-          <w:hyperlink w:anchor="_Toc240608737" w:history="1">
+          <w:hyperlink w:anchor="_Toc240639228" w:history="1">
             <w:r>
               <w:rPr>
                 <w:rStyle w:val="Hipervnculo"/>
@@ -1021,7 +1021,7 @@
               <w:rPr>
                 <w:noProof/>
               </w:rPr>
-              <w:instrText xml:space="preserve"> PAGEREF _Toc240608737 \h </w:instrText>
+              <w:instrText xml:space="preserve"> PAGEREF _Toc240639228 \h </w:instrText>
             </w:r>
             <w:r>
               <w:rPr>
@@ -1063,7 +1063,7 @@
               <w14:ligatures w14:val="standardContextual"/>
             </w:rPr>
           </w:pPr>
-          <w:hyperlink w:anchor="_Toc240608738" w:history="1">
+          <w:hyperlink w:anchor="_Toc240639229" w:history="1">
             <w:r>
               <w:rPr>
                 <w:rStyle w:val="Hipervnculo"/>
@@ -1087,7 +1087,7 @@
               <w:rPr>
                 <w:noProof/>
               </w:rPr>
-              <w:instrText xml:space="preserve"> PAGEREF _Toc240608738 \h </w:instrText>
+              <w:instrText xml:space="preserve"> PAGEREF _Toc240639229 \h </w:instrText>
             </w:r>
             <w:r>
               <w:rPr>
@@ -1129,7 +1129,7 @@
               <w14:ligatures w14:val="standardContextual"/>
             </w:rPr>
           </w:pPr>
-          <w:hyperlink w:anchor="_Toc240608739" w:history="1">
+          <w:hyperlink w:anchor="_Toc240639230" w:history="1">
             <w:r>
               <w:rPr>
                 <w:rStyle w:val="Hipervnculo"/>
@@ -1153,7 +1153,7 @@
               <w:rPr>
                 <w:noProof/>
               </w:rPr>
-              <w:instrText xml:space="preserve"> PAGEREF _Toc240608739 \h </w:instrText>
+              <w:instrText xml:space="preserve"> PAGEREF _Toc240639230 \h </w:instrText>
             </w:r>
             <w:r>
               <w:rPr>
@@ -1195,7 +1195,7 @@
               <w14:ligatures w14:val="standardContextual"/>
             </w:rPr>
           </w:pPr>
-          <w:hyperlink w:anchor="_Toc240608740" w:history="1">
+          <w:hyperlink w:anchor="_Toc240639231" w:history="1">
             <w:r>
               <w:rPr>
                 <w:rStyle w:val="Hipervnculo"/>
@@ -1219,7 +1219,7 @@
               <w:rPr>
                 <w:noProof/>
               </w:rPr>
-              <w:instrText xml:space="preserve"> PAGEREF _Toc240608740 \h </w:instrText>
+              <w:instrText xml:space="preserve"> PAGEREF _Toc240639231 \h </w:instrText>
             </w:r>
             <w:r>
               <w:rPr>
@@ -1262,7 +1262,7 @@
       <w:pPr>
         <w:pStyle w:val="Ttulo1"/>
       </w:pPr>
-      <w:bookmarkStart w:id="0" w:name="_Toc240608727"/>
+      <w:bookmarkStart w:id="0" w:name="_Toc240639218"/>
       <w:r>
         <w:t>1. INTRODUCCIÓN</w:t>
       </w:r>
@@ -1299,7 +1299,7 @@
       <w:pPr>
         <w:pStyle w:val="Ttulo1"/>
       </w:pPr>
-      <w:bookmarkStart w:id="1" w:name="_Toc240608728"/>
+      <w:bookmarkStart w:id="1" w:name="_Toc240639219"/>
       <w:r>
         <w:t>2. ARQUITECTURA DE LA SOLUCIÓN</w:t>
       </w:r>
@@ -1309,7 +1309,7 @@
       <w:pPr>
         <w:pStyle w:val="Ttulo2"/>
       </w:pPr>
-      <w:bookmarkStart w:id="2" w:name="_Toc240608729"/>
+      <w:bookmarkStart w:id="2" w:name="_Toc240639220"/>
       <w:r>
         <w:t>2.1 Un único artefacto</w:t>
       </w:r>
@@ -1337,7 +1337,7 @@
       <w:pPr>
         <w:pStyle w:val="Ttulo2"/>
       </w:pPr>
-      <w:bookmarkStart w:id="3" w:name="_Toc240608730"/>
+      <w:bookmarkStart w:id="3" w:name="_Toc240639221"/>
       <w:r>
         <w:t>2.2 Carga única al arrancar</w:t>
       </w:r>
@@ -1356,7 +1356,7 @@
       <w:pPr>
         <w:pStyle w:val="Ttulo2"/>
       </w:pPr>
-      <w:bookmarkStart w:id="4" w:name="_Toc240608731"/>
+      <w:bookmarkStart w:id="4" w:name="_Toc240639222"/>
       <w:r>
         <w:t>2.3 Las dos direcciones del servicio</w:t>
       </w:r>
@@ -1391,7 +1391,7 @@
           <w:left w:w="10" w:type="dxa"/>
           <w:right w:w="10" w:type="dxa"/>
         </w:tblCellMar>
-        <w:tblLook w:val="04A0" w:firstRow="1" w:lastRow="0" w:firstColumn="1" w:lastColumn="0" w:noHBand="0" w:noVBand="1"/>
+        <w:tblLook w:val="0000" w:firstRow="0" w:lastRow="0" w:firstColumn="0" w:lastColumn="0" w:noHBand="0" w:noVBand="0"/>
       </w:tblPr>
       <w:tblGrid>
         <w:gridCol w:w="1500"/>
@@ -1731,10 +1731,10 @@
           <w:noProof/>
         </w:rPr>
         <w:drawing>
-          <wp:inline distT="0" distB="0" distL="0" distR="0" wp14:anchorId="25C3099C" wp14:editId="46547805">
+          <wp:inline distT="0" distB="0" distL="0" distR="0" wp14:anchorId="6FAF86F3" wp14:editId="3BD90AB2">
             <wp:extent cx="5391150" cy="3076575"/>
             <wp:effectExtent l="0" t="0" r="0" b="0"/>
-            <wp:docPr id="1576149216" name="Imagen 1576149216"/>
+            <wp:docPr id="397186909" name="Imagen 397186909"/>
             <wp:cNvGraphicFramePr>
               <a:graphicFrameLocks xmlns:a="http://schemas.openxmlformats.org/drawingml/2006/main" noChangeAspect="1"/>
             </wp:cNvGraphicFramePr>
@@ -1789,7 +1789,7 @@
       <w:pPr>
         <w:pStyle w:val="Ttulo1"/>
       </w:pPr>
-      <w:bookmarkStart w:id="5" w:name="_Toc240608732"/>
+      <w:bookmarkStart w:id="5" w:name="_Toc240639223"/>
       <w:r>
         <w:t>3. CONTRATO DE ENTRADA Y SALIDA</w:t>
       </w:r>
@@ -1799,7 +1799,7 @@
       <w:pPr>
         <w:pStyle w:val="Ttulo2"/>
       </w:pPr>
-      <w:bookmarkStart w:id="6" w:name="_Toc240608733"/>
+      <w:bookmarkStart w:id="6" w:name="_Toc240639224"/>
       <w:r>
         <w:t>3.1 Entrada</w:t>
       </w:r>
@@ -1852,7 +1852,7 @@
           <w:left w:w="10" w:type="dxa"/>
           <w:right w:w="10" w:type="dxa"/>
         </w:tblCellMar>
-        <w:tblLook w:val="04A0" w:firstRow="1" w:lastRow="0" w:firstColumn="1" w:lastColumn="0" w:noHBand="0" w:noVBand="1"/>
+        <w:tblLook w:val="0000" w:firstRow="0" w:lastRow="0" w:firstColumn="0" w:lastColumn="0" w:noHBand="0" w:noVBand="0"/>
       </w:tblPr>
       <w:tblGrid>
         <w:gridCol w:w="2100"/>
@@ -2234,7 +2234,7 @@
                 <w:sz w:val="20"/>
                 <w:szCs w:val="20"/>
               </w:rPr>
-              <w:t>Escalas de 1 a 5</w:t>
+              <w:t>Escalas de encuesta</w:t>
             </w:r>
           </w:p>
         </w:tc>
@@ -2274,7 +2274,7 @@
                 <w:sz w:val="20"/>
                 <w:szCs w:val="20"/>
               </w:rPr>
-              <w:t>Números enteros, tratados como números según la decisión de la Entrega 1</w:t>
+              <w:t>Enteros de 1 (baja) a 4 (alta); desempeño 3 o 4. Se tratan como números, según la decisión de la Entrega 1</w:t>
             </w:r>
           </w:p>
         </w:tc>
@@ -2319,10 +2319,10 @@
           <w:noProof/>
         </w:rPr>
         <w:drawing>
-          <wp:inline distT="0" distB="0" distL="0" distR="0" wp14:anchorId="318D2332" wp14:editId="0E8C04AB">
+          <wp:inline distT="0" distB="0" distL="0" distR="0" wp14:anchorId="107C103B" wp14:editId="02875871">
             <wp:extent cx="5391150" cy="2952750"/>
             <wp:effectExtent l="0" t="0" r="0" b="0"/>
-            <wp:docPr id="1789943845" name="Imagen 1789943845"/>
+            <wp:docPr id="982117693" name="Imagen 982117693"/>
             <wp:cNvGraphicFramePr>
               <a:graphicFrameLocks xmlns:a="http://schemas.openxmlformats.org/drawingml/2006/main" noChangeAspect="1"/>
             </wp:cNvGraphicFramePr>
@@ -2377,7 +2377,7 @@
       <w:pPr>
         <w:pStyle w:val="Ttulo2"/>
       </w:pPr>
-      <w:bookmarkStart w:id="7" w:name="_Toc240608734"/>
+      <w:bookmarkStart w:id="7" w:name="_Toc240639225"/>
       <w:r>
         <w:t>3.2 Salida</w:t>
       </w:r>
@@ -2405,7 +2405,7 @@
       <w:pPr>
         <w:pStyle w:val="Ttulo1"/>
       </w:pPr>
-      <w:bookmarkStart w:id="8" w:name="_Toc240608735"/>
+      <w:bookmarkStart w:id="8" w:name="_Toc240639226"/>
       <w:r>
         <w:t>4. PRUEBA CON TRES EMPLEADOS</w:t>
       </w:r>
@@ -2449,7 +2449,7 @@
           <w:left w:w="10" w:type="dxa"/>
           <w:right w:w="10" w:type="dxa"/>
         </w:tblCellMar>
-        <w:tblLook w:val="04A0" w:firstRow="1" w:lastRow="0" w:firstColumn="1" w:lastColumn="0" w:noHBand="0" w:noVBand="1"/>
+        <w:tblLook w:val="0000" w:firstRow="0" w:lastRow="0" w:firstColumn="0" w:lastColumn="0" w:noHBand="0" w:noVBand="0"/>
       </w:tblPr>
       <w:tblGrid>
         <w:gridCol w:w="1300"/>
@@ -2948,10 +2948,10 @@
           <w:noProof/>
         </w:rPr>
         <w:drawing>
-          <wp:inline distT="0" distB="0" distL="0" distR="0" wp14:anchorId="2C9BBCE2" wp14:editId="6DA9FCBF">
+          <wp:inline distT="0" distB="0" distL="0" distR="0" wp14:anchorId="1D589296" wp14:editId="69FC4C6C">
             <wp:extent cx="5391150" cy="2152650"/>
             <wp:effectExtent l="0" t="0" r="0" b="0"/>
-            <wp:docPr id="448449272" name="Imagen 448449272"/>
+            <wp:docPr id="50874477" name="Imagen 50874477"/>
             <wp:cNvGraphicFramePr>
               <a:graphicFrameLocks xmlns:a="http://schemas.openxmlformats.org/drawingml/2006/main" noChangeAspect="1"/>
             </wp:cNvGraphicFramePr>
@@ -3015,7 +3015,7 @@
       <w:pPr>
         <w:pStyle w:val="Ttulo1"/>
       </w:pPr>
-      <w:bookmarkStart w:id="9" w:name="_Toc240608736"/>
+      <w:bookmarkStart w:id="9" w:name="_Toc240639227"/>
       <w:r>
         <w:t>5. VALIDACIÓN DE LAS ENTRADAS</w:t>
       </w:r>
@@ -3043,7 +3043,7 @@
       <w:pPr>
         <w:pStyle w:val="Ttulo1"/>
       </w:pPr>
-      <w:bookmarkStart w:id="10" w:name="_Toc240608737"/>
+      <w:bookmarkStart w:id="10" w:name="_Toc240639228"/>
       <w:r>
         <w:t>6. EJECUCIÓN Y DEMOSTRACIÓN</w:t>
       </w:r>
@@ -3080,7 +3080,7 @@
       <w:pPr>
         <w:pStyle w:val="Ttulo1"/>
       </w:pPr>
-      <w:bookmarkStart w:id="11" w:name="_Toc240608738"/>
+      <w:bookmarkStart w:id="11" w:name="_Toc240639229"/>
       <w:r>
         <w:t>7. CONCLUSIONES</w:t>
       </w:r>
@@ -3124,7 +3124,7 @@
           <w:left w:w="10" w:type="dxa"/>
           <w:right w:w="10" w:type="dxa"/>
         </w:tblCellMar>
-        <w:tblLook w:val="04A0" w:firstRow="1" w:lastRow="0" w:firstColumn="1" w:lastColumn="0" w:noHBand="0" w:noVBand="1"/>
+        <w:tblLook w:val="0000" w:firstRow="0" w:lastRow="0" w:firstColumn="0" w:lastColumn="0" w:noHBand="0" w:noVBand="0"/>
       </w:tblPr>
       <w:tblGrid>
         <w:gridCol w:w="3000"/>
@@ -3468,7 +3468,7 @@
       <w:pPr>
         <w:pStyle w:val="Ttulo1"/>
       </w:pPr>
-      <w:bookmarkStart w:id="12" w:name="_Toc240608739"/>
+      <w:bookmarkStart w:id="12" w:name="_Toc240639230"/>
       <w:r>
         <w:t>8. LINK COLAB</w:t>
       </w:r>
@@ -3501,7 +3501,7 @@
       <w:pPr>
         <w:pStyle w:val="Ttulo1"/>
       </w:pPr>
-      <w:bookmarkStart w:id="13" w:name="_Toc240608740"/>
+      <w:bookmarkStart w:id="13" w:name="_Toc240639231"/>
       <w:r>
         <w:t>9. REFERENCIAS</w:t>
       </w:r>
@@ -3649,10 +3649,10 @@
 <file path=word/numbering.xml><?xml version="1.0" encoding="utf-8"?>
 <w:numbering xmlns:wpc="http://schemas.microsoft.com/office/word/2010/wordprocessingCanvas" xmlns:cx="http://schemas.microsoft.com/office/drawing/2014/chartex" xmlns:cx1="http://schemas.microsoft.com/office/drawing/2015/9/8/chartex" xmlns:cx2="http://schemas.microsoft.com/office/drawing/2015/10/21/chartex" xmlns:cx3="http://schemas.microsoft.com/office/drawing/2016/5/9/chartex" xmlns:cx4="http://schemas.microsoft.com/office/drawing/2016/5/10/chartex" xmlns:cx5="http://schemas.microsoft.com/office/drawing/2016/5/11/chartex" xmlns:cx6="http://schemas.microsoft.com/office/drawing/2016/5/12/chartex" xmlns:cx7="http://schemas.microsoft.com/office/drawing/2016/5/13/chartex" xmlns:cx8="http://schemas.microsoft.com/office/drawing/2016/5/14/chartex" xmlns:mc="http://schemas.openxmlformats.org/markup-compatibility/2006" xmlns:aink="http://schemas.microsoft.com/office/drawing/2016/ink" xmlns:am3d="http://schemas.microsoft.com/office/drawing/2017/model3d" xmlns:o="urn:schemas-microsoft-com:office:office" xmlns:oel="http://schemas.microsoft.com/office/2019/extlst" xmlns:r="http://schemas.openxmlformats.org/officeDocument/2006/relationships" xmlns:m="http://schemas.openxmlformats.org/officeDocument/2006/math" xmlns:v="urn:schemas-microsoft-com:vml" xmlns:wp14="http://schemas.microsoft.com/office/word/2010/wordprocessingDrawing" xmlns:wp="http://schemas.openxmlformats.org/drawingml/2006/wordprocessingDrawing" xmlns:w10="urn:schemas-microsoft-com:office:word" xmlns:w="http://schemas.openxmlformats.org/wordprocessingml/2006/main" xmlns:w14="http://schemas.microsoft.com/office/word/2010/wordml" xmlns:w15="http://schemas.microsoft.com/office/word/2012/wordml" xmlns:w16cex="http://schemas.microsoft.com/office/word/2018/wordml/cex" xmlns:w16cid="http://schemas.microsoft.com/office/word/2016/wordml/cid" xmlns:w16="http://schemas.microsoft.com/office/word/2018/wordml" xmlns:w16du="http://schemas.microsoft.com/office/word/2023/wordml/word16du" xmlns:w16sdtdh="http://schemas.microsoft.com/office/word/2020/wordml/sdtdatahash" xmlns:w16sdtfl="http://schemas.microsoft.com/office/word/2024/wordml/sdtformatlock" xmlns:w16se="http://schemas.microsoft.com/office/word/2015/wordml/symex" xmlns:wpg="http://schemas.microsoft.com/office/word/2010/wordprocessingGroup" xmlns:wpi="http://schemas.microsoft.com/office/word/2010/wordprocessingInk" xmlns:wne="http://schemas.microsoft.com/office/word/2006/wordml" xmlns:wps="http://schemas.microsoft.com/office/word/2010/wordprocessingShape" mc:Ignorable="w14 w15 w16se w16cid w16 w16cex w16sdtdh w16sdtfl w16du wp14">
   <w:abstractNum w:abstractNumId="0" w15:restartNumberingAfterBreak="0">
-    <w:nsid w:val="610002E0"/>
+    <w:nsid w:val="238E4215"/>
     <w:multiLevelType w:val="hybridMultilevel"/>
-    <w:tmpl w:val="72CC5C12"/>
-    <w:lvl w:ilvl="0" w:tplc="718EF0AC">
+    <w:tmpl w:val="6C5200FE"/>
+    <w:lvl w:ilvl="0" w:tplc="7EAE5F4C">
       <w:start w:val="1"/>
       <w:numFmt w:val="bullet"/>
       <w:lvlText w:val="●"/>
@@ -3661,7 +3661,7 @@
         <w:ind w:left="720" w:hanging="360"/>
       </w:pPr>
     </w:lvl>
-    <w:lvl w:ilvl="1" w:tplc="8F2887B8">
+    <w:lvl w:ilvl="1" w:tplc="5B4246A8">
       <w:start w:val="1"/>
       <w:numFmt w:val="bullet"/>
       <w:lvlText w:val="○"/>
@@ -3670,7 +3670,7 @@
         <w:ind w:left="1440" w:hanging="360"/>
       </w:pPr>
     </w:lvl>
-    <w:lvl w:ilvl="2" w:tplc="2F8A46B6">
+    <w:lvl w:ilvl="2" w:tplc="F7CA8CC8">
       <w:start w:val="1"/>
       <w:numFmt w:val="bullet"/>
       <w:lvlText w:val="■"/>
@@ -3679,7 +3679,7 @@
         <w:ind w:left="2160" w:hanging="360"/>
       </w:pPr>
     </w:lvl>
-    <w:lvl w:ilvl="3" w:tplc="0770BC0C">
+    <w:lvl w:ilvl="3" w:tplc="5CF825EA">
       <w:start w:val="1"/>
       <w:numFmt w:val="bullet"/>
       <w:lvlText w:val="●"/>
@@ -3688,7 +3688,7 @@
         <w:ind w:left="2880" w:hanging="360"/>
       </w:pPr>
     </w:lvl>
-    <w:lvl w:ilvl="4" w:tplc="A582081C">
+    <w:lvl w:ilvl="4" w:tplc="C722D854">
       <w:start w:val="1"/>
       <w:numFmt w:val="bullet"/>
       <w:lvlText w:val="○"/>
@@ -3697,7 +3697,7 @@
         <w:ind w:left="3600" w:hanging="360"/>
       </w:pPr>
     </w:lvl>
-    <w:lvl w:ilvl="5" w:tplc="95F45CFC">
+    <w:lvl w:ilvl="5" w:tplc="99B8D204">
       <w:start w:val="1"/>
       <w:numFmt w:val="bullet"/>
       <w:lvlText w:val="■"/>
@@ -3706,7 +3706,7 @@
         <w:ind w:left="4320" w:hanging="360"/>
       </w:pPr>
     </w:lvl>
-    <w:lvl w:ilvl="6" w:tplc="C19036B2">
+    <w:lvl w:ilvl="6" w:tplc="8B7A5888">
       <w:start w:val="1"/>
       <w:numFmt w:val="bullet"/>
       <w:lvlText w:val="●"/>
@@ -3715,7 +3715,7 @@
         <w:ind w:left="5040" w:hanging="360"/>
       </w:pPr>
     </w:lvl>
-    <w:lvl w:ilvl="7" w:tplc="B0485B28">
+    <w:lvl w:ilvl="7" w:tplc="DA440230">
       <w:start w:val="1"/>
       <w:numFmt w:val="bullet"/>
       <w:lvlText w:val="●"/>
@@ -3724,7 +3724,7 @@
         <w:ind w:left="5760" w:hanging="360"/>
       </w:pPr>
     </w:lvl>
-    <w:lvl w:ilvl="8" w:tplc="7018BDA0">
+    <w:lvl w:ilvl="8" w:tplc="604A79C0">
       <w:start w:val="1"/>
       <w:numFmt w:val="bullet"/>
       <w:lvlText w:val="●"/>
@@ -3735,10 +3735,10 @@
     </w:lvl>
   </w:abstractNum>
   <w:abstractNum w:abstractNumId="1" w15:restartNumberingAfterBreak="0">
-    <w:nsid w:val="6F695E0A"/>
+    <w:nsid w:val="5635646C"/>
     <w:multiLevelType w:val="hybridMultilevel"/>
-    <w:tmpl w:val="FD846670"/>
-    <w:lvl w:ilvl="0" w:tplc="42EEFA7E">
+    <w:tmpl w:val="9CFC0A78"/>
+    <w:lvl w:ilvl="0" w:tplc="13E0EDB8">
       <w:start w:val="1"/>
       <w:numFmt w:val="bullet"/>
       <w:lvlText w:val="•"/>
@@ -3747,54 +3747,54 @@
         <w:ind w:left="720" w:hanging="360"/>
       </w:pPr>
     </w:lvl>
-    <w:lvl w:ilvl="1" w:tplc="498A8B36">
+    <w:lvl w:ilvl="1" w:tplc="72D4A238">
       <w:numFmt w:val="decimal"/>
       <w:lvlText w:val=""/>
       <w:lvlJc w:val="left"/>
     </w:lvl>
-    <w:lvl w:ilvl="2" w:tplc="2F623548">
+    <w:lvl w:ilvl="2" w:tplc="CD1429D8">
       <w:numFmt w:val="decimal"/>
       <w:lvlText w:val=""/>
       <w:lvlJc w:val="left"/>
     </w:lvl>
-    <w:lvl w:ilvl="3" w:tplc="904AE72E">
+    <w:lvl w:ilvl="3" w:tplc="C99AAB9A">
       <w:numFmt w:val="decimal"/>
       <w:lvlText w:val=""/>
       <w:lvlJc w:val="left"/>
     </w:lvl>
-    <w:lvl w:ilvl="4" w:tplc="97947CB6">
+    <w:lvl w:ilvl="4" w:tplc="A72A6D7C">
       <w:numFmt w:val="decimal"/>
       <w:lvlText w:val=""/>
       <w:lvlJc w:val="left"/>
     </w:lvl>
-    <w:lvl w:ilvl="5" w:tplc="F97213E4">
+    <w:lvl w:ilvl="5" w:tplc="A7F62CF8">
       <w:numFmt w:val="decimal"/>
       <w:lvlText w:val=""/>
       <w:lvlJc w:val="left"/>
     </w:lvl>
-    <w:lvl w:ilvl="6" w:tplc="6F381FDE">
+    <w:lvl w:ilvl="6" w:tplc="7806DB54">
       <w:numFmt w:val="decimal"/>
       <w:lvlText w:val=""/>
       <w:lvlJc w:val="left"/>
     </w:lvl>
-    <w:lvl w:ilvl="7" w:tplc="F34C63DA">
+    <w:lvl w:ilvl="7" w:tplc="C442BFF0">
       <w:numFmt w:val="decimal"/>
       <w:lvlText w:val=""/>
       <w:lvlJc w:val="left"/>
     </w:lvl>
-    <w:lvl w:ilvl="8" w:tplc="0D4C7834">
+    <w:lvl w:ilvl="8" w:tplc="FF262184">
       <w:numFmt w:val="decimal"/>
       <w:lvlText w:val=""/>
       <w:lvlJc w:val="left"/>
     </w:lvl>
   </w:abstractNum>
-  <w:num w:numId="1" w16cid:durableId="1355424682">
+  <w:num w:numId="1" w16cid:durableId="4946663">
     <w:abstractNumId w:val="0"/>
     <w:lvlOverride w:ilvl="0">
       <w:startOverride w:val="1"/>
     </w:lvlOverride>
   </w:num>
-  <w:num w:numId="2" w16cid:durableId="499856063">
+  <w:num w:numId="2" w16cid:durableId="1800878103">
     <w:abstractNumId w:val="1"/>
     <w:lvlOverride w:ilvl="0">
       <w:startOverride w:val="1"/>
@@ -4415,7 +4415,7 @@
     <w:autoRedefine/>
     <w:uiPriority w:val="39"/>
     <w:unhideWhenUsed/>
-    <w:rsid w:val="00237716"/>
+    <w:rsid w:val="004900DB"/>
     <w:pPr>
       <w:spacing w:after="100"/>
     </w:pPr>
@@ -4427,7 +4427,7 @@
     <w:autoRedefine/>
     <w:uiPriority w:val="39"/>
     <w:unhideWhenUsed/>
-    <w:rsid w:val="00237716"/>
+    <w:rsid w:val="004900DB"/>
     <w:pPr>
       <w:spacing w:after="100"/>
       <w:ind w:left="220"/>

</xml_diff>

<commit_message>
Entrega 3: informe sin rutas de carpetas y sin el parrafo de formas alternativas
Co-Authored-By: Claude Opus 5 <noreply@anthropic.com>
</commit_message>
<xml_diff>
--- a/entregas/Entrega3_RAFFO.docx
+++ b/entregas/Entrega3_RAFFO.docx
@@ -12,7 +12,7 @@
           <w:noProof/>
         </w:rPr>
         <w:drawing>
-          <wp:inline distT="0" distB="0" distL="0" distR="0" wp14:anchorId="45CB9D0F" wp14:editId="2F551FBE">
+          <wp:inline distT="0" distB="0" distL="0" distR="0" wp14:anchorId="0D4F3BDE" wp14:editId="33B874C3">
             <wp:extent cx="1466850" cy="314325"/>
             <wp:effectExtent l="0" t="0" r="0" b="0"/>
             <wp:docPr id="1" name="Imagen 1"/>
@@ -309,7 +309,7 @@
     <w:sdt>
       <w:sdtPr>
         <w:alias w:val="Índice"/>
-        <w:id w:val="-510293070"/>
+        <w:id w:val="-966189104"/>
       </w:sdtPr>
       <w:sdtEndPr/>
       <w:sdtContent>
@@ -337,7 +337,7 @@
           <w:r>
             <w:fldChar w:fldCharType="separate"/>
           </w:r>
-          <w:hyperlink w:anchor="_Toc240639218" w:history="1">
+          <w:hyperlink w:anchor="_Toc240639717" w:history="1">
             <w:r>
               <w:rPr>
                 <w:rStyle w:val="Hipervnculo"/>
@@ -361,7 +361,7 @@
               <w:rPr>
                 <w:noProof/>
               </w:rPr>
-              <w:instrText xml:space="preserve"> PAGEREF _Toc240639218 \h </w:instrText>
+              <w:instrText xml:space="preserve"> PAGEREF _Toc240639717 \h </w:instrText>
             </w:r>
             <w:r>
               <w:rPr>
@@ -403,7 +403,7 @@
               <w14:ligatures w14:val="standardContextual"/>
             </w:rPr>
           </w:pPr>
-          <w:hyperlink w:anchor="_Toc240639219" w:history="1">
+          <w:hyperlink w:anchor="_Toc240639718" w:history="1">
             <w:r>
               <w:rPr>
                 <w:rStyle w:val="Hipervnculo"/>
@@ -427,7 +427,7 @@
               <w:rPr>
                 <w:noProof/>
               </w:rPr>
-              <w:instrText xml:space="preserve"> PAGEREF _Toc240639219 \h </w:instrText>
+              <w:instrText xml:space="preserve"> PAGEREF _Toc240639718 \h </w:instrText>
             </w:r>
             <w:r>
               <w:rPr>
@@ -469,7 +469,7 @@
               <w14:ligatures w14:val="standardContextual"/>
             </w:rPr>
           </w:pPr>
-          <w:hyperlink w:anchor="_Toc240639220" w:history="1">
+          <w:hyperlink w:anchor="_Toc240639719" w:history="1">
             <w:r>
               <w:rPr>
                 <w:rStyle w:val="Hipervnculo"/>
@@ -493,7 +493,7 @@
               <w:rPr>
                 <w:noProof/>
               </w:rPr>
-              <w:instrText xml:space="preserve"> PAGEREF _Toc240639220 \h </w:instrText>
+              <w:instrText xml:space="preserve"> PAGEREF _Toc240639719 \h </w:instrText>
             </w:r>
             <w:r>
               <w:rPr>
@@ -535,7 +535,7 @@
               <w14:ligatures w14:val="standardContextual"/>
             </w:rPr>
           </w:pPr>
-          <w:hyperlink w:anchor="_Toc240639221" w:history="1">
+          <w:hyperlink w:anchor="_Toc240639720" w:history="1">
             <w:r>
               <w:rPr>
                 <w:rStyle w:val="Hipervnculo"/>
@@ -559,7 +559,7 @@
               <w:rPr>
                 <w:noProof/>
               </w:rPr>
-              <w:instrText xml:space="preserve"> PAGEREF _Toc240639221 \h </w:instrText>
+              <w:instrText xml:space="preserve"> PAGEREF _Toc240639720 \h </w:instrText>
             </w:r>
             <w:r>
               <w:rPr>
@@ -601,7 +601,7 @@
               <w14:ligatures w14:val="standardContextual"/>
             </w:rPr>
           </w:pPr>
-          <w:hyperlink w:anchor="_Toc240639222" w:history="1">
+          <w:hyperlink w:anchor="_Toc240639721" w:history="1">
             <w:r>
               <w:rPr>
                 <w:rStyle w:val="Hipervnculo"/>
@@ -625,7 +625,7 @@
               <w:rPr>
                 <w:noProof/>
               </w:rPr>
-              <w:instrText xml:space="preserve"> PAGEREF _Toc240639222 \h </w:instrText>
+              <w:instrText xml:space="preserve"> PAGEREF _Toc240639721 \h </w:instrText>
             </w:r>
             <w:r>
               <w:rPr>
@@ -667,7 +667,7 @@
               <w14:ligatures w14:val="standardContextual"/>
             </w:rPr>
           </w:pPr>
-          <w:hyperlink w:anchor="_Toc240639223" w:history="1">
+          <w:hyperlink w:anchor="_Toc240639722" w:history="1">
             <w:r>
               <w:rPr>
                 <w:rStyle w:val="Hipervnculo"/>
@@ -691,7 +691,7 @@
               <w:rPr>
                 <w:noProof/>
               </w:rPr>
-              <w:instrText xml:space="preserve"> PAGEREF _Toc240639223 \h </w:instrText>
+              <w:instrText xml:space="preserve"> PAGEREF _Toc240639722 \h </w:instrText>
             </w:r>
             <w:r>
               <w:rPr>
@@ -733,7 +733,7 @@
               <w14:ligatures w14:val="standardContextual"/>
             </w:rPr>
           </w:pPr>
-          <w:hyperlink w:anchor="_Toc240639224" w:history="1">
+          <w:hyperlink w:anchor="_Toc240639723" w:history="1">
             <w:r>
               <w:rPr>
                 <w:rStyle w:val="Hipervnculo"/>
@@ -757,7 +757,7 @@
               <w:rPr>
                 <w:noProof/>
               </w:rPr>
-              <w:instrText xml:space="preserve"> PAGEREF _Toc240639224 \h </w:instrText>
+              <w:instrText xml:space="preserve"> PAGEREF _Toc240639723 \h </w:instrText>
             </w:r>
             <w:r>
               <w:rPr>
@@ -799,7 +799,7 @@
               <w14:ligatures w14:val="standardContextual"/>
             </w:rPr>
           </w:pPr>
-          <w:hyperlink w:anchor="_Toc240639225" w:history="1">
+          <w:hyperlink w:anchor="_Toc240639724" w:history="1">
             <w:r>
               <w:rPr>
                 <w:rStyle w:val="Hipervnculo"/>
@@ -823,7 +823,7 @@
               <w:rPr>
                 <w:noProof/>
               </w:rPr>
-              <w:instrText xml:space="preserve"> PAGEREF _Toc240639225 \h </w:instrText>
+              <w:instrText xml:space="preserve"> PAGEREF _Toc240639724 \h </w:instrText>
             </w:r>
             <w:r>
               <w:rPr>
@@ -865,7 +865,7 @@
               <w14:ligatures w14:val="standardContextual"/>
             </w:rPr>
           </w:pPr>
-          <w:hyperlink w:anchor="_Toc240639226" w:history="1">
+          <w:hyperlink w:anchor="_Toc240639725" w:history="1">
             <w:r>
               <w:rPr>
                 <w:rStyle w:val="Hipervnculo"/>
@@ -889,7 +889,7 @@
               <w:rPr>
                 <w:noProof/>
               </w:rPr>
-              <w:instrText xml:space="preserve"> PAGEREF _Toc240639226 \h </w:instrText>
+              <w:instrText xml:space="preserve"> PAGEREF _Toc240639725 \h </w:instrText>
             </w:r>
             <w:r>
               <w:rPr>
@@ -931,7 +931,7 @@
               <w14:ligatures w14:val="standardContextual"/>
             </w:rPr>
           </w:pPr>
-          <w:hyperlink w:anchor="_Toc240639227" w:history="1">
+          <w:hyperlink w:anchor="_Toc240639726" w:history="1">
             <w:r>
               <w:rPr>
                 <w:rStyle w:val="Hipervnculo"/>
@@ -955,7 +955,7 @@
               <w:rPr>
                 <w:noProof/>
               </w:rPr>
-              <w:instrText xml:space="preserve"> PAGEREF _Toc240639227 \h </w:instrText>
+              <w:instrText xml:space="preserve"> PAGEREF _Toc240639726 \h </w:instrText>
             </w:r>
             <w:r>
               <w:rPr>
@@ -997,7 +997,7 @@
               <w14:ligatures w14:val="standardContextual"/>
             </w:rPr>
           </w:pPr>
-          <w:hyperlink w:anchor="_Toc240639228" w:history="1">
+          <w:hyperlink w:anchor="_Toc240639727" w:history="1">
             <w:r>
               <w:rPr>
                 <w:rStyle w:val="Hipervnculo"/>
@@ -1021,7 +1021,7 @@
               <w:rPr>
                 <w:noProof/>
               </w:rPr>
-              <w:instrText xml:space="preserve"> PAGEREF _Toc240639228 \h </w:instrText>
+              <w:instrText xml:space="preserve"> PAGEREF _Toc240639727 \h </w:instrText>
             </w:r>
             <w:r>
               <w:rPr>
@@ -1063,7 +1063,7 @@
               <w14:ligatures w14:val="standardContextual"/>
             </w:rPr>
           </w:pPr>
-          <w:hyperlink w:anchor="_Toc240639229" w:history="1">
+          <w:hyperlink w:anchor="_Toc240639728" w:history="1">
             <w:r>
               <w:rPr>
                 <w:rStyle w:val="Hipervnculo"/>
@@ -1087,7 +1087,7 @@
               <w:rPr>
                 <w:noProof/>
               </w:rPr>
-              <w:instrText xml:space="preserve"> PAGEREF _Toc240639229 \h </w:instrText>
+              <w:instrText xml:space="preserve"> PAGEREF _Toc240639728 \h </w:instrText>
             </w:r>
             <w:r>
               <w:rPr>
@@ -1129,7 +1129,7 @@
               <w14:ligatures w14:val="standardContextual"/>
             </w:rPr>
           </w:pPr>
-          <w:hyperlink w:anchor="_Toc240639230" w:history="1">
+          <w:hyperlink w:anchor="_Toc240639729" w:history="1">
             <w:r>
               <w:rPr>
                 <w:rStyle w:val="Hipervnculo"/>
@@ -1153,7 +1153,7 @@
               <w:rPr>
                 <w:noProof/>
               </w:rPr>
-              <w:instrText xml:space="preserve"> PAGEREF _Toc240639230 \h </w:instrText>
+              <w:instrText xml:space="preserve"> PAGEREF _Toc240639729 \h </w:instrText>
             </w:r>
             <w:r>
               <w:rPr>
@@ -1195,7 +1195,7 @@
               <w14:ligatures w14:val="standardContextual"/>
             </w:rPr>
           </w:pPr>
-          <w:hyperlink w:anchor="_Toc240639231" w:history="1">
+          <w:hyperlink w:anchor="_Toc240639730" w:history="1">
             <w:r>
               <w:rPr>
                 <w:rStyle w:val="Hipervnculo"/>
@@ -1219,7 +1219,7 @@
               <w:rPr>
                 <w:noProof/>
               </w:rPr>
-              <w:instrText xml:space="preserve"> PAGEREF _Toc240639231 \h </w:instrText>
+              <w:instrText xml:space="preserve"> PAGEREF _Toc240639730 \h </w:instrText>
             </w:r>
             <w:r>
               <w:rPr>
@@ -1262,7 +1262,7 @@
       <w:pPr>
         <w:pStyle w:val="Ttulo1"/>
       </w:pPr>
-      <w:bookmarkStart w:id="0" w:name="_Toc240639218"/>
+      <w:bookmarkStart w:id="0" w:name="_Toc240639717"/>
       <w:r>
         <w:t>1. INTRODUCCIÓN</w:t>
       </w:r>
@@ -1274,7 +1274,7 @@
         <w:jc w:val="both"/>
       </w:pPr>
       <w:r>
-        <w:t>La Entrega 1 dejó los datos preparados y un grupo de examen apartado antes de cualquier transformación. La Entrega 2 entrenó un único modelo, una regresión logística con pesos de clase, lo ajustó por validación cruzada, fijó el punto de corte en 0,40 con criterio de negocio y guardó todo en un único archivo: models/modelo_attrition.pkl.</w:t>
+        <w:t>La Entrega 1 dejó los datos preparados y un grupo de examen apartado antes de cualquier transformación. La Entrega 2 entrenó un único modelo, una regresión logística con pesos de clase, lo ajustó por validación cruzada, fijó el punto de corte en 0,40 con criterio de negocio y guardó todo en un único archivo.</w:t>
       </w:r>
     </w:p>
     <w:p>
@@ -1299,7 +1299,7 @@
       <w:pPr>
         <w:pStyle w:val="Ttulo1"/>
       </w:pPr>
-      <w:bookmarkStart w:id="1" w:name="_Toc240639219"/>
+      <w:bookmarkStart w:id="1" w:name="_Toc240639718"/>
       <w:r>
         <w:t>2. ARQUITECTURA DE LA SOLUCIÓN</w:t>
       </w:r>
@@ -1309,7 +1309,7 @@
       <w:pPr>
         <w:pStyle w:val="Ttulo2"/>
       </w:pPr>
-      <w:bookmarkStart w:id="2" w:name="_Toc240639220"/>
+      <w:bookmarkStart w:id="2" w:name="_Toc240639719"/>
       <w:r>
         <w:t>2.1 Un único artefacto</w:t>
       </w:r>
@@ -1321,7 +1321,7 @@
         <w:jc w:val="both"/>
       </w:pPr>
       <w:r>
-        <w:t>El archivo models/modelo_attrition.pkl contiene tres cosas dentro de un mismo objeto: la receta de preparación (estandarización de las variables numéricas y codificación de las categóricas), el modelo entrenado con su configuración y el punto de corte de 0,40. El servicio lo carga con una sola línea y le pasa los datos crudos del empleado, tal como están en la tabla de Recursos Humanos.</w:t>
+        <w:t>Ese archivo contiene tres cosas dentro de un mismo objeto: la receta de preparación (estandarización de las variables numéricas y codificación de las categóricas), el modelo entrenado con su configuración y el punto de corte de 0,40. El servicio lo carga con una sola línea y le pasa los datos crudos del empleado, tal como están en la tabla de Recursos Humanos.</w:t>
       </w:r>
     </w:p>
     <w:p>
@@ -1337,7 +1337,7 @@
       <w:pPr>
         <w:pStyle w:val="Ttulo2"/>
       </w:pPr>
-      <w:bookmarkStart w:id="3" w:name="_Toc240639221"/>
+      <w:bookmarkStart w:id="3" w:name="_Toc240639720"/>
       <w:r>
         <w:t>2.2 Carga única al arrancar</w:t>
       </w:r>
@@ -1356,7 +1356,7 @@
       <w:pPr>
         <w:pStyle w:val="Ttulo2"/>
       </w:pPr>
-      <w:bookmarkStart w:id="4" w:name="_Toc240639222"/>
+      <w:bookmarkStart w:id="4" w:name="_Toc240639721"/>
       <w:r>
         <w:t>2.3 Las dos direcciones del servicio</w:t>
       </w:r>
@@ -1731,10 +1731,10 @@
           <w:noProof/>
         </w:rPr>
         <w:drawing>
-          <wp:inline distT="0" distB="0" distL="0" distR="0" wp14:anchorId="6FAF86F3" wp14:editId="3BD90AB2">
+          <wp:inline distT="0" distB="0" distL="0" distR="0" wp14:anchorId="466430C2" wp14:editId="0CAF6D1A">
             <wp:extent cx="5391150" cy="3076575"/>
             <wp:effectExtent l="0" t="0" r="0" b="0"/>
-            <wp:docPr id="397186909" name="Imagen 397186909"/>
+            <wp:docPr id="1229541250" name="Imagen 1229541250"/>
             <wp:cNvGraphicFramePr>
               <a:graphicFrameLocks xmlns:a="http://schemas.openxmlformats.org/drawingml/2006/main" noChangeAspect="1"/>
             </wp:cNvGraphicFramePr>
@@ -1789,7 +1789,7 @@
       <w:pPr>
         <w:pStyle w:val="Ttulo1"/>
       </w:pPr>
-      <w:bookmarkStart w:id="5" w:name="_Toc240639223"/>
+      <w:bookmarkStart w:id="5" w:name="_Toc240639722"/>
       <w:r>
         <w:t>3. CONTRATO DE ENTRADA Y SALIDA</w:t>
       </w:r>
@@ -1799,7 +1799,7 @@
       <w:pPr>
         <w:pStyle w:val="Ttulo2"/>
       </w:pPr>
-      <w:bookmarkStart w:id="6" w:name="_Toc240639224"/>
+      <w:bookmarkStart w:id="6" w:name="_Toc240639723"/>
       <w:r>
         <w:t>3.1 Entrada</w:t>
       </w:r>
@@ -2319,10 +2319,10 @@
           <w:noProof/>
         </w:rPr>
         <w:drawing>
-          <wp:inline distT="0" distB="0" distL="0" distR="0" wp14:anchorId="107C103B" wp14:editId="02875871">
+          <wp:inline distT="0" distB="0" distL="0" distR="0" wp14:anchorId="40F94421" wp14:editId="35B77CFB">
             <wp:extent cx="5391150" cy="2952750"/>
             <wp:effectExtent l="0" t="0" r="0" b="0"/>
-            <wp:docPr id="982117693" name="Imagen 982117693"/>
+            <wp:docPr id="1173643600" name="Imagen 1173643600"/>
             <wp:cNvGraphicFramePr>
               <a:graphicFrameLocks xmlns:a="http://schemas.openxmlformats.org/drawingml/2006/main" noChangeAspect="1"/>
             </wp:cNvGraphicFramePr>
@@ -2377,7 +2377,7 @@
       <w:pPr>
         <w:pStyle w:val="Ttulo2"/>
       </w:pPr>
-      <w:bookmarkStart w:id="7" w:name="_Toc240639225"/>
+      <w:bookmarkStart w:id="7" w:name="_Toc240639724"/>
       <w:r>
         <w:t>3.2 Salida</w:t>
       </w:r>
@@ -2405,7 +2405,7 @@
       <w:pPr>
         <w:pStyle w:val="Ttulo1"/>
       </w:pPr>
-      <w:bookmarkStart w:id="8" w:name="_Toc240639226"/>
+      <w:bookmarkStart w:id="8" w:name="_Toc240639725"/>
       <w:r>
         <w:t>4. PRUEBA CON TRES EMPLEADOS</w:t>
       </w:r>
@@ -2417,7 +2417,7 @@
         <w:jc w:val="both"/>
       </w:pPr>
       <w:r>
-        <w:t>El servicio se probó con tres empleados reales del grupo de examen, que el modelo nunca vio durante el entrenamiento, elegidos para cubrir los tres casos que Recursos Humanos va a encontrar en la práctica. Sus datos están en el archivo api/ejemplos.json y el script api/probar_ejemplos.py los envía al servicio y muestra las respuestas.</w:t>
+        <w:t>El servicio se probó con tres empleados reales del grupo de examen, que el modelo nunca vio durante el entrenamiento, elegidos para cubrir los tres casos que Recursos Humanos va a encontrar en la práctica. Sus datos quedaron guardados junto al servicio y se envían con un script que muestra las tres respuestas.</w:t>
       </w:r>
     </w:p>
     <w:p>
@@ -2948,10 +2948,10 @@
           <w:noProof/>
         </w:rPr>
         <w:drawing>
-          <wp:inline distT="0" distB="0" distL="0" distR="0" wp14:anchorId="1D589296" wp14:editId="69FC4C6C">
+          <wp:inline distT="0" distB="0" distL="0" distR="0" wp14:anchorId="5B427E9A" wp14:editId="20FFB67C">
             <wp:extent cx="5391150" cy="2152650"/>
             <wp:effectExtent l="0" t="0" r="0" b="0"/>
-            <wp:docPr id="50874477" name="Imagen 50874477"/>
+            <wp:docPr id="1765666892" name="Imagen 1765666892"/>
             <wp:cNvGraphicFramePr>
               <a:graphicFrameLocks xmlns:a="http://schemas.openxmlformats.org/drawingml/2006/main" noChangeAspect="1"/>
             </wp:cNvGraphicFramePr>
@@ -3015,7 +3015,7 @@
       <w:pPr>
         <w:pStyle w:val="Ttulo1"/>
       </w:pPr>
-      <w:bookmarkStart w:id="9" w:name="_Toc240639227"/>
+      <w:bookmarkStart w:id="9" w:name="_Toc240639726"/>
       <w:r>
         <w:t>5. VALIDACIÓN DE LAS ENTRADAS</w:t>
       </w:r>
@@ -3043,7 +3043,7 @@
       <w:pPr>
         <w:pStyle w:val="Ttulo1"/>
       </w:pPr>
-      <w:bookmarkStart w:id="10" w:name="_Toc240639228"/>
+      <w:bookmarkStart w:id="10" w:name="_Toc240639727"/>
       <w:r>
         <w:t>6. EJECUCIÓN Y DEMOSTRACIÓN</w:t>
       </w:r>
@@ -3064,23 +3064,14 @@
         <w:jc w:val="both"/>
       </w:pPr>
       <w:r>
-        <w:t>Las otras dos formas de consultarlo son el script api/probar_ejemplos.py, que envía los tres empleados de prueba, y una llamada directa desde la línea de comandos con curl, enviando el archivo api/ejemplo.json.</w:t>
-      </w:r>
-    </w:p>
-    <w:p>
-      <w:pPr>
-        <w:spacing w:after="120" w:line="276" w:lineRule="auto"/>
-        <w:jc w:val="both"/>
-      </w:pPr>
-      <w:r>
-        <w:t>Para quien no quiera instalar nada, el cuaderno notebooks/03_api_demo.ipynb hace todo lo anterior dentro de Google Colab: levanta el servicio en segundo plano, comprueba que está vivo, envía los tres empleados, muestra el rechazo de un dato inválido y lo apaga.</w:t>
+        <w:t>Para quien no quiera instalar nada, el cuaderno de esta entrega hace lo mismo dentro de Google Colab: levanta el servicio en segundo plano, comprueba que está vivo, envía los tres empleados, muestra el rechazo de un dato inválido y lo apaga.</w:t>
       </w:r>
     </w:p>
     <w:p>
       <w:pPr>
         <w:pStyle w:val="Ttulo1"/>
       </w:pPr>
-      <w:bookmarkStart w:id="11" w:name="_Toc240639229"/>
+      <w:bookmarkStart w:id="11" w:name="_Toc240639728"/>
       <w:r>
         <w:t>7. CONCLUSIONES</w:t>
       </w:r>
@@ -3468,7 +3459,7 @@
       <w:pPr>
         <w:pStyle w:val="Ttulo1"/>
       </w:pPr>
-      <w:bookmarkStart w:id="12" w:name="_Toc240639230"/>
+      <w:bookmarkStart w:id="12" w:name="_Toc240639729"/>
       <w:r>
         <w:t>8. LINK COLAB</w:t>
       </w:r>
@@ -3501,7 +3492,7 @@
       <w:pPr>
         <w:pStyle w:val="Ttulo1"/>
       </w:pPr>
-      <w:bookmarkStart w:id="13" w:name="_Toc240639231"/>
+      <w:bookmarkStart w:id="13" w:name="_Toc240639730"/>
       <w:r>
         <w:t>9. REFERENCIAS</w:t>
       </w:r>
@@ -3649,10 +3640,10 @@
 <file path=word/numbering.xml><?xml version="1.0" encoding="utf-8"?>
 <w:numbering xmlns:wpc="http://schemas.microsoft.com/office/word/2010/wordprocessingCanvas" xmlns:cx="http://schemas.microsoft.com/office/drawing/2014/chartex" xmlns:cx1="http://schemas.microsoft.com/office/drawing/2015/9/8/chartex" xmlns:cx2="http://schemas.microsoft.com/office/drawing/2015/10/21/chartex" xmlns:cx3="http://schemas.microsoft.com/office/drawing/2016/5/9/chartex" xmlns:cx4="http://schemas.microsoft.com/office/drawing/2016/5/10/chartex" xmlns:cx5="http://schemas.microsoft.com/office/drawing/2016/5/11/chartex" xmlns:cx6="http://schemas.microsoft.com/office/drawing/2016/5/12/chartex" xmlns:cx7="http://schemas.microsoft.com/office/drawing/2016/5/13/chartex" xmlns:cx8="http://schemas.microsoft.com/office/drawing/2016/5/14/chartex" xmlns:mc="http://schemas.openxmlformats.org/markup-compatibility/2006" xmlns:aink="http://schemas.microsoft.com/office/drawing/2016/ink" xmlns:am3d="http://schemas.microsoft.com/office/drawing/2017/model3d" xmlns:o="urn:schemas-microsoft-com:office:office" xmlns:oel="http://schemas.microsoft.com/office/2019/extlst" xmlns:r="http://schemas.openxmlformats.org/officeDocument/2006/relationships" xmlns:m="http://schemas.openxmlformats.org/officeDocument/2006/math" xmlns:v="urn:schemas-microsoft-com:vml" xmlns:wp14="http://schemas.microsoft.com/office/word/2010/wordprocessingDrawing" xmlns:wp="http://schemas.openxmlformats.org/drawingml/2006/wordprocessingDrawing" xmlns:w10="urn:schemas-microsoft-com:office:word" xmlns:w="http://schemas.openxmlformats.org/wordprocessingml/2006/main" xmlns:w14="http://schemas.microsoft.com/office/word/2010/wordml" xmlns:w15="http://schemas.microsoft.com/office/word/2012/wordml" xmlns:w16cex="http://schemas.microsoft.com/office/word/2018/wordml/cex" xmlns:w16cid="http://schemas.microsoft.com/office/word/2016/wordml/cid" xmlns:w16="http://schemas.microsoft.com/office/word/2018/wordml" xmlns:w16du="http://schemas.microsoft.com/office/word/2023/wordml/word16du" xmlns:w16sdtdh="http://schemas.microsoft.com/office/word/2020/wordml/sdtdatahash" xmlns:w16sdtfl="http://schemas.microsoft.com/office/word/2024/wordml/sdtformatlock" xmlns:w16se="http://schemas.microsoft.com/office/word/2015/wordml/symex" xmlns:wpg="http://schemas.microsoft.com/office/word/2010/wordprocessingGroup" xmlns:wpi="http://schemas.microsoft.com/office/word/2010/wordprocessingInk" xmlns:wne="http://schemas.microsoft.com/office/word/2006/wordml" xmlns:wps="http://schemas.microsoft.com/office/word/2010/wordprocessingShape" mc:Ignorable="w14 w15 w16se w16cid w16 w16cex w16sdtdh w16sdtfl w16du wp14">
   <w:abstractNum w:abstractNumId="0" w15:restartNumberingAfterBreak="0">
-    <w:nsid w:val="238E4215"/>
+    <w:nsid w:val="2E217101"/>
     <w:multiLevelType w:val="hybridMultilevel"/>
-    <w:tmpl w:val="6C5200FE"/>
-    <w:lvl w:ilvl="0" w:tplc="7EAE5F4C">
+    <w:tmpl w:val="A2AC458C"/>
+    <w:lvl w:ilvl="0" w:tplc="74C6421E">
       <w:start w:val="1"/>
       <w:numFmt w:val="bullet"/>
       <w:lvlText w:val="●"/>
@@ -3661,7 +3652,7 @@
         <w:ind w:left="720" w:hanging="360"/>
       </w:pPr>
     </w:lvl>
-    <w:lvl w:ilvl="1" w:tplc="5B4246A8">
+    <w:lvl w:ilvl="1" w:tplc="0646FFCC">
       <w:start w:val="1"/>
       <w:numFmt w:val="bullet"/>
       <w:lvlText w:val="○"/>
@@ -3670,7 +3661,7 @@
         <w:ind w:left="1440" w:hanging="360"/>
       </w:pPr>
     </w:lvl>
-    <w:lvl w:ilvl="2" w:tplc="F7CA8CC8">
+    <w:lvl w:ilvl="2" w:tplc="D1E0FB3E">
       <w:start w:val="1"/>
       <w:numFmt w:val="bullet"/>
       <w:lvlText w:val="■"/>
@@ -3679,7 +3670,7 @@
         <w:ind w:left="2160" w:hanging="360"/>
       </w:pPr>
     </w:lvl>
-    <w:lvl w:ilvl="3" w:tplc="5CF825EA">
+    <w:lvl w:ilvl="3" w:tplc="00AAC10E">
       <w:start w:val="1"/>
       <w:numFmt w:val="bullet"/>
       <w:lvlText w:val="●"/>
@@ -3688,7 +3679,7 @@
         <w:ind w:left="2880" w:hanging="360"/>
       </w:pPr>
     </w:lvl>
-    <w:lvl w:ilvl="4" w:tplc="C722D854">
+    <w:lvl w:ilvl="4" w:tplc="E7180158">
       <w:start w:val="1"/>
       <w:numFmt w:val="bullet"/>
       <w:lvlText w:val="○"/>
@@ -3697,7 +3688,7 @@
         <w:ind w:left="3600" w:hanging="360"/>
       </w:pPr>
     </w:lvl>
-    <w:lvl w:ilvl="5" w:tplc="99B8D204">
+    <w:lvl w:ilvl="5" w:tplc="DC229F1C">
       <w:start w:val="1"/>
       <w:numFmt w:val="bullet"/>
       <w:lvlText w:val="■"/>
@@ -3706,7 +3697,7 @@
         <w:ind w:left="4320" w:hanging="360"/>
       </w:pPr>
     </w:lvl>
-    <w:lvl w:ilvl="6" w:tplc="8B7A5888">
+    <w:lvl w:ilvl="6" w:tplc="A6709C76">
       <w:start w:val="1"/>
       <w:numFmt w:val="bullet"/>
       <w:lvlText w:val="●"/>
@@ -3715,7 +3706,7 @@
         <w:ind w:left="5040" w:hanging="360"/>
       </w:pPr>
     </w:lvl>
-    <w:lvl w:ilvl="7" w:tplc="DA440230">
+    <w:lvl w:ilvl="7" w:tplc="F1329768">
       <w:start w:val="1"/>
       <w:numFmt w:val="bullet"/>
       <w:lvlText w:val="●"/>
@@ -3724,7 +3715,7 @@
         <w:ind w:left="5760" w:hanging="360"/>
       </w:pPr>
     </w:lvl>
-    <w:lvl w:ilvl="8" w:tplc="604A79C0">
+    <w:lvl w:ilvl="8" w:tplc="FA8E9ED6">
       <w:start w:val="1"/>
       <w:numFmt w:val="bullet"/>
       <w:lvlText w:val="●"/>
@@ -3735,10 +3726,10 @@
     </w:lvl>
   </w:abstractNum>
   <w:abstractNum w:abstractNumId="1" w15:restartNumberingAfterBreak="0">
-    <w:nsid w:val="5635646C"/>
+    <w:nsid w:val="7FCA3840"/>
     <w:multiLevelType w:val="hybridMultilevel"/>
-    <w:tmpl w:val="9CFC0A78"/>
-    <w:lvl w:ilvl="0" w:tplc="13E0EDB8">
+    <w:tmpl w:val="5C3E21D4"/>
+    <w:lvl w:ilvl="0" w:tplc="47D2995C">
       <w:start w:val="1"/>
       <w:numFmt w:val="bullet"/>
       <w:lvlText w:val="•"/>
@@ -3747,54 +3738,54 @@
         <w:ind w:left="720" w:hanging="360"/>
       </w:pPr>
     </w:lvl>
-    <w:lvl w:ilvl="1" w:tplc="72D4A238">
+    <w:lvl w:ilvl="1" w:tplc="E4425B1C">
       <w:numFmt w:val="decimal"/>
       <w:lvlText w:val=""/>
       <w:lvlJc w:val="left"/>
     </w:lvl>
-    <w:lvl w:ilvl="2" w:tplc="CD1429D8">
+    <w:lvl w:ilvl="2" w:tplc="CFA236FA">
       <w:numFmt w:val="decimal"/>
       <w:lvlText w:val=""/>
       <w:lvlJc w:val="left"/>
     </w:lvl>
-    <w:lvl w:ilvl="3" w:tplc="C99AAB9A">
+    <w:lvl w:ilvl="3" w:tplc="76866C48">
       <w:numFmt w:val="decimal"/>
       <w:lvlText w:val=""/>
       <w:lvlJc w:val="left"/>
     </w:lvl>
-    <w:lvl w:ilvl="4" w:tplc="A72A6D7C">
+    <w:lvl w:ilvl="4" w:tplc="8DEAF71E">
       <w:numFmt w:val="decimal"/>
       <w:lvlText w:val=""/>
       <w:lvlJc w:val="left"/>
     </w:lvl>
-    <w:lvl w:ilvl="5" w:tplc="A7F62CF8">
+    <w:lvl w:ilvl="5" w:tplc="D63A0CDA">
       <w:numFmt w:val="decimal"/>
       <w:lvlText w:val=""/>
       <w:lvlJc w:val="left"/>
     </w:lvl>
-    <w:lvl w:ilvl="6" w:tplc="7806DB54">
+    <w:lvl w:ilvl="6" w:tplc="80F6EC3C">
       <w:numFmt w:val="decimal"/>
       <w:lvlText w:val=""/>
       <w:lvlJc w:val="left"/>
     </w:lvl>
-    <w:lvl w:ilvl="7" w:tplc="C442BFF0">
+    <w:lvl w:ilvl="7" w:tplc="3E3037CA">
       <w:numFmt w:val="decimal"/>
       <w:lvlText w:val=""/>
       <w:lvlJc w:val="left"/>
     </w:lvl>
-    <w:lvl w:ilvl="8" w:tplc="FF262184">
+    <w:lvl w:ilvl="8" w:tplc="AF8AC1A2">
       <w:numFmt w:val="decimal"/>
       <w:lvlText w:val=""/>
       <w:lvlJc w:val="left"/>
     </w:lvl>
   </w:abstractNum>
-  <w:num w:numId="1" w16cid:durableId="4946663">
+  <w:num w:numId="1" w16cid:durableId="1022167873">
     <w:abstractNumId w:val="0"/>
     <w:lvlOverride w:ilvl="0">
       <w:startOverride w:val="1"/>
     </w:lvlOverride>
   </w:num>
-  <w:num w:numId="2" w16cid:durableId="1800878103">
+  <w:num w:numId="2" w16cid:durableId="221447052">
     <w:abstractNumId w:val="1"/>
     <w:lvlOverride w:ilvl="0">
       <w:startOverride w:val="1"/>
@@ -4415,7 +4406,7 @@
     <w:autoRedefine/>
     <w:uiPriority w:val="39"/>
     <w:unhideWhenUsed/>
-    <w:rsid w:val="004900DB"/>
+    <w:rsid w:val="00542B24"/>
     <w:pPr>
       <w:spacing w:after="100"/>
     </w:pPr>
@@ -4427,7 +4418,7 @@
     <w:autoRedefine/>
     <w:uiPriority w:val="39"/>
     <w:unhideWhenUsed/>
-    <w:rsid w:val="004900DB"/>
+    <w:rsid w:val="00542B24"/>
     <w:pPr>
       <w:spacing w:after="100"/>
       <w:ind w:left="220"/>

</xml_diff>

<commit_message>
Entrega 3: ultima revision del informe
Co-Authored-By: Claude Fable 5.1 <noreply@anthropic.com>
</commit_message>
<xml_diff>
--- a/entregas/Entrega3_RAFFO.docx
+++ b/entregas/Entrega3_RAFFO.docx
@@ -12,7 +12,7 @@
           <w:noProof/>
         </w:rPr>
         <w:drawing>
-          <wp:inline distT="0" distB="0" distL="0" distR="0" wp14:anchorId="0D4F3BDE" wp14:editId="33B874C3">
+          <wp:inline distT="0" distB="0" distL="0" distR="0" wp14:anchorId="0978A1CE" wp14:editId="73E40E2F">
             <wp:extent cx="1466850" cy="314325"/>
             <wp:effectExtent l="0" t="0" r="0" b="0"/>
             <wp:docPr id="1" name="Imagen 1"/>
@@ -309,7 +309,7 @@
     <w:sdt>
       <w:sdtPr>
         <w:alias w:val="Índice"/>
-        <w:id w:val="-966189104"/>
+        <w:id w:val="1722471067"/>
       </w:sdtPr>
       <w:sdtEndPr/>
       <w:sdtContent>
@@ -337,7 +337,7 @@
           <w:r>
             <w:fldChar w:fldCharType="separate"/>
           </w:r>
-          <w:hyperlink w:anchor="_Toc240639717" w:history="1">
+          <w:hyperlink w:anchor="_Toc240640308" w:history="1">
             <w:r>
               <w:rPr>
                 <w:rStyle w:val="Hipervnculo"/>
@@ -361,7 +361,7 @@
               <w:rPr>
                 <w:noProof/>
               </w:rPr>
-              <w:instrText xml:space="preserve"> PAGEREF _Toc240639717 \h </w:instrText>
+              <w:instrText xml:space="preserve"> PAGEREF _Toc240640308 \h </w:instrText>
             </w:r>
             <w:r>
               <w:rPr>
@@ -403,7 +403,7 @@
               <w14:ligatures w14:val="standardContextual"/>
             </w:rPr>
           </w:pPr>
-          <w:hyperlink w:anchor="_Toc240639718" w:history="1">
+          <w:hyperlink w:anchor="_Toc240640309" w:history="1">
             <w:r>
               <w:rPr>
                 <w:rStyle w:val="Hipervnculo"/>
@@ -427,7 +427,7 @@
               <w:rPr>
                 <w:noProof/>
               </w:rPr>
-              <w:instrText xml:space="preserve"> PAGEREF _Toc240639718 \h </w:instrText>
+              <w:instrText xml:space="preserve"> PAGEREF _Toc240640309 \h </w:instrText>
             </w:r>
             <w:r>
               <w:rPr>
@@ -469,7 +469,7 @@
               <w14:ligatures w14:val="standardContextual"/>
             </w:rPr>
           </w:pPr>
-          <w:hyperlink w:anchor="_Toc240639719" w:history="1">
+          <w:hyperlink w:anchor="_Toc240640310" w:history="1">
             <w:r>
               <w:rPr>
                 <w:rStyle w:val="Hipervnculo"/>
@@ -493,7 +493,7 @@
               <w:rPr>
                 <w:noProof/>
               </w:rPr>
-              <w:instrText xml:space="preserve"> PAGEREF _Toc240639719 \h </w:instrText>
+              <w:instrText xml:space="preserve"> PAGEREF _Toc240640310 \h </w:instrText>
             </w:r>
             <w:r>
               <w:rPr>
@@ -535,7 +535,7 @@
               <w14:ligatures w14:val="standardContextual"/>
             </w:rPr>
           </w:pPr>
-          <w:hyperlink w:anchor="_Toc240639720" w:history="1">
+          <w:hyperlink w:anchor="_Toc240640311" w:history="1">
             <w:r>
               <w:rPr>
                 <w:rStyle w:val="Hipervnculo"/>
@@ -559,7 +559,7 @@
               <w:rPr>
                 <w:noProof/>
               </w:rPr>
-              <w:instrText xml:space="preserve"> PAGEREF _Toc240639720 \h </w:instrText>
+              <w:instrText xml:space="preserve"> PAGEREF _Toc240640311 \h </w:instrText>
             </w:r>
             <w:r>
               <w:rPr>
@@ -601,7 +601,7 @@
               <w14:ligatures w14:val="standardContextual"/>
             </w:rPr>
           </w:pPr>
-          <w:hyperlink w:anchor="_Toc240639721" w:history="1">
+          <w:hyperlink w:anchor="_Toc240640312" w:history="1">
             <w:r>
               <w:rPr>
                 <w:rStyle w:val="Hipervnculo"/>
@@ -625,7 +625,7 @@
               <w:rPr>
                 <w:noProof/>
               </w:rPr>
-              <w:instrText xml:space="preserve"> PAGEREF _Toc240639721 \h </w:instrText>
+              <w:instrText xml:space="preserve"> PAGEREF _Toc240640312 \h </w:instrText>
             </w:r>
             <w:r>
               <w:rPr>
@@ -667,7 +667,7 @@
               <w14:ligatures w14:val="standardContextual"/>
             </w:rPr>
           </w:pPr>
-          <w:hyperlink w:anchor="_Toc240639722" w:history="1">
+          <w:hyperlink w:anchor="_Toc240640313" w:history="1">
             <w:r>
               <w:rPr>
                 <w:rStyle w:val="Hipervnculo"/>
@@ -691,7 +691,7 @@
               <w:rPr>
                 <w:noProof/>
               </w:rPr>
-              <w:instrText xml:space="preserve"> PAGEREF _Toc240639722 \h </w:instrText>
+              <w:instrText xml:space="preserve"> PAGEREF _Toc240640313 \h </w:instrText>
             </w:r>
             <w:r>
               <w:rPr>
@@ -733,7 +733,7 @@
               <w14:ligatures w14:val="standardContextual"/>
             </w:rPr>
           </w:pPr>
-          <w:hyperlink w:anchor="_Toc240639723" w:history="1">
+          <w:hyperlink w:anchor="_Toc240640314" w:history="1">
             <w:r>
               <w:rPr>
                 <w:rStyle w:val="Hipervnculo"/>
@@ -757,7 +757,7 @@
               <w:rPr>
                 <w:noProof/>
               </w:rPr>
-              <w:instrText xml:space="preserve"> PAGEREF _Toc240639723 \h </w:instrText>
+              <w:instrText xml:space="preserve"> PAGEREF _Toc240640314 \h </w:instrText>
             </w:r>
             <w:r>
               <w:rPr>
@@ -799,7 +799,7 @@
               <w14:ligatures w14:val="standardContextual"/>
             </w:rPr>
           </w:pPr>
-          <w:hyperlink w:anchor="_Toc240639724" w:history="1">
+          <w:hyperlink w:anchor="_Toc240640315" w:history="1">
             <w:r>
               <w:rPr>
                 <w:rStyle w:val="Hipervnculo"/>
@@ -823,7 +823,7 @@
               <w:rPr>
                 <w:noProof/>
               </w:rPr>
-              <w:instrText xml:space="preserve"> PAGEREF _Toc240639724 \h </w:instrText>
+              <w:instrText xml:space="preserve"> PAGEREF _Toc240640315 \h </w:instrText>
             </w:r>
             <w:r>
               <w:rPr>
@@ -865,7 +865,7 @@
               <w14:ligatures w14:val="standardContextual"/>
             </w:rPr>
           </w:pPr>
-          <w:hyperlink w:anchor="_Toc240639725" w:history="1">
+          <w:hyperlink w:anchor="_Toc240640316" w:history="1">
             <w:r>
               <w:rPr>
                 <w:rStyle w:val="Hipervnculo"/>
@@ -889,7 +889,7 @@
               <w:rPr>
                 <w:noProof/>
               </w:rPr>
-              <w:instrText xml:space="preserve"> PAGEREF _Toc240639725 \h </w:instrText>
+              <w:instrText xml:space="preserve"> PAGEREF _Toc240640316 \h </w:instrText>
             </w:r>
             <w:r>
               <w:rPr>
@@ -931,7 +931,7 @@
               <w14:ligatures w14:val="standardContextual"/>
             </w:rPr>
           </w:pPr>
-          <w:hyperlink w:anchor="_Toc240639726" w:history="1">
+          <w:hyperlink w:anchor="_Toc240640317" w:history="1">
             <w:r>
               <w:rPr>
                 <w:rStyle w:val="Hipervnculo"/>
@@ -955,7 +955,7 @@
               <w:rPr>
                 <w:noProof/>
               </w:rPr>
-              <w:instrText xml:space="preserve"> PAGEREF _Toc240639726 \h </w:instrText>
+              <w:instrText xml:space="preserve"> PAGEREF _Toc240640317 \h </w:instrText>
             </w:r>
             <w:r>
               <w:rPr>
@@ -997,7 +997,7 @@
               <w14:ligatures w14:val="standardContextual"/>
             </w:rPr>
           </w:pPr>
-          <w:hyperlink w:anchor="_Toc240639727" w:history="1">
+          <w:hyperlink w:anchor="_Toc240640318" w:history="1">
             <w:r>
               <w:rPr>
                 <w:rStyle w:val="Hipervnculo"/>
@@ -1021,7 +1021,7 @@
               <w:rPr>
                 <w:noProof/>
               </w:rPr>
-              <w:instrText xml:space="preserve"> PAGEREF _Toc240639727 \h </w:instrText>
+              <w:instrText xml:space="preserve"> PAGEREF _Toc240640318 \h </w:instrText>
             </w:r>
             <w:r>
               <w:rPr>
@@ -1063,7 +1063,7 @@
               <w14:ligatures w14:val="standardContextual"/>
             </w:rPr>
           </w:pPr>
-          <w:hyperlink w:anchor="_Toc240639728" w:history="1">
+          <w:hyperlink w:anchor="_Toc240640319" w:history="1">
             <w:r>
               <w:rPr>
                 <w:rStyle w:val="Hipervnculo"/>
@@ -1087,7 +1087,7 @@
               <w:rPr>
                 <w:noProof/>
               </w:rPr>
-              <w:instrText xml:space="preserve"> PAGEREF _Toc240639728 \h </w:instrText>
+              <w:instrText xml:space="preserve"> PAGEREF _Toc240640319 \h </w:instrText>
             </w:r>
             <w:r>
               <w:rPr>
@@ -1129,7 +1129,7 @@
               <w14:ligatures w14:val="standardContextual"/>
             </w:rPr>
           </w:pPr>
-          <w:hyperlink w:anchor="_Toc240639729" w:history="1">
+          <w:hyperlink w:anchor="_Toc240640320" w:history="1">
             <w:r>
               <w:rPr>
                 <w:rStyle w:val="Hipervnculo"/>
@@ -1153,7 +1153,7 @@
               <w:rPr>
                 <w:noProof/>
               </w:rPr>
-              <w:instrText xml:space="preserve"> PAGEREF _Toc240639729 \h </w:instrText>
+              <w:instrText xml:space="preserve"> PAGEREF _Toc240640320 \h </w:instrText>
             </w:r>
             <w:r>
               <w:rPr>
@@ -1195,7 +1195,7 @@
               <w14:ligatures w14:val="standardContextual"/>
             </w:rPr>
           </w:pPr>
-          <w:hyperlink w:anchor="_Toc240639730" w:history="1">
+          <w:hyperlink w:anchor="_Toc240640321" w:history="1">
             <w:r>
               <w:rPr>
                 <w:rStyle w:val="Hipervnculo"/>
@@ -1219,7 +1219,7 @@
               <w:rPr>
                 <w:noProof/>
               </w:rPr>
-              <w:instrText xml:space="preserve"> PAGEREF _Toc240639730 \h </w:instrText>
+              <w:instrText xml:space="preserve"> PAGEREF _Toc240640321 \h </w:instrText>
             </w:r>
             <w:r>
               <w:rPr>
@@ -1262,7 +1262,7 @@
       <w:pPr>
         <w:pStyle w:val="Ttulo1"/>
       </w:pPr>
-      <w:bookmarkStart w:id="0" w:name="_Toc240639717"/>
+      <w:bookmarkStart w:id="0" w:name="_Toc240640308"/>
       <w:r>
         <w:t>1. INTRODUCCIÓN</w:t>
       </w:r>
@@ -1299,7 +1299,7 @@
       <w:pPr>
         <w:pStyle w:val="Ttulo1"/>
       </w:pPr>
-      <w:bookmarkStart w:id="1" w:name="_Toc240639718"/>
+      <w:bookmarkStart w:id="1" w:name="_Toc240640309"/>
       <w:r>
         <w:t>2. ARQUITECTURA DE LA SOLUCIÓN</w:t>
       </w:r>
@@ -1309,7 +1309,7 @@
       <w:pPr>
         <w:pStyle w:val="Ttulo2"/>
       </w:pPr>
-      <w:bookmarkStart w:id="2" w:name="_Toc240639719"/>
+      <w:bookmarkStart w:id="2" w:name="_Toc240640310"/>
       <w:r>
         <w:t>2.1 Un único artefacto</w:t>
       </w:r>
@@ -1321,7 +1321,7 @@
         <w:jc w:val="both"/>
       </w:pPr>
       <w:r>
-        <w:t>Ese archivo contiene tres cosas dentro de un mismo objeto: la receta de preparación (estandarización de las variables numéricas y codificación de las categóricas), el modelo entrenado con su configuración y el punto de corte de 0,40. El servicio lo carga con una sola línea y le pasa los datos crudos del empleado, tal como están en la tabla de Recursos Humanos.</w:t>
+        <w:t>El archivo guardado en la Entrega 2 contiene tres cosas dentro de un mismo objeto: la receta de preparación (estandarización de las variables numéricas y codificación de las categóricas), el modelo entrenado con su configuración y el punto de corte de 0,40. El servicio lo carga con una sola línea y le pasa los datos crudos del empleado, tal como están en la tabla de Recursos Humanos.</w:t>
       </w:r>
     </w:p>
     <w:p>
@@ -1337,7 +1337,7 @@
       <w:pPr>
         <w:pStyle w:val="Ttulo2"/>
       </w:pPr>
-      <w:bookmarkStart w:id="3" w:name="_Toc240639720"/>
+      <w:bookmarkStart w:id="3" w:name="_Toc240640311"/>
       <w:r>
         <w:t>2.2 Carga única al arrancar</w:t>
       </w:r>
@@ -1356,7 +1356,7 @@
       <w:pPr>
         <w:pStyle w:val="Ttulo2"/>
       </w:pPr>
-      <w:bookmarkStart w:id="4" w:name="_Toc240639721"/>
+      <w:bookmarkStart w:id="4" w:name="_Toc240640312"/>
       <w:r>
         <w:t>2.3 Las dos direcciones del servicio</w:t>
       </w:r>
@@ -1391,7 +1391,7 @@
           <w:left w:w="10" w:type="dxa"/>
           <w:right w:w="10" w:type="dxa"/>
         </w:tblCellMar>
-        <w:tblLook w:val="0000" w:firstRow="0" w:lastRow="0" w:firstColumn="0" w:lastColumn="0" w:noHBand="0" w:noVBand="0"/>
+        <w:tblLook w:val="04A0" w:firstRow="1" w:lastRow="0" w:firstColumn="1" w:lastColumn="0" w:noHBand="0" w:noVBand="1"/>
       </w:tblPr>
       <w:tblGrid>
         <w:gridCol w:w="1500"/>
@@ -1731,10 +1731,10 @@
           <w:noProof/>
         </w:rPr>
         <w:drawing>
-          <wp:inline distT="0" distB="0" distL="0" distR="0" wp14:anchorId="466430C2" wp14:editId="0CAF6D1A">
+          <wp:inline distT="0" distB="0" distL="0" distR="0" wp14:anchorId="0F0123AD" wp14:editId="39C26E67">
             <wp:extent cx="5391150" cy="3076575"/>
             <wp:effectExtent l="0" t="0" r="0" b="0"/>
-            <wp:docPr id="1229541250" name="Imagen 1229541250"/>
+            <wp:docPr id="726957603" name="Imagen 726957603"/>
             <wp:cNvGraphicFramePr>
               <a:graphicFrameLocks xmlns:a="http://schemas.openxmlformats.org/drawingml/2006/main" noChangeAspect="1"/>
             </wp:cNvGraphicFramePr>
@@ -1789,7 +1789,7 @@
       <w:pPr>
         <w:pStyle w:val="Ttulo1"/>
       </w:pPr>
-      <w:bookmarkStart w:id="5" w:name="_Toc240639722"/>
+      <w:bookmarkStart w:id="5" w:name="_Toc240640313"/>
       <w:r>
         <w:t>3. CONTRATO DE ENTRADA Y SALIDA</w:t>
       </w:r>
@@ -1799,7 +1799,7 @@
       <w:pPr>
         <w:pStyle w:val="Ttulo2"/>
       </w:pPr>
-      <w:bookmarkStart w:id="6" w:name="_Toc240639723"/>
+      <w:bookmarkStart w:id="6" w:name="_Toc240640314"/>
       <w:r>
         <w:t>3.1 Entrada</w:t>
       </w:r>
@@ -1852,7 +1852,7 @@
           <w:left w:w="10" w:type="dxa"/>
           <w:right w:w="10" w:type="dxa"/>
         </w:tblCellMar>
-        <w:tblLook w:val="0000" w:firstRow="0" w:lastRow="0" w:firstColumn="0" w:lastColumn="0" w:noHBand="0" w:noVBand="0"/>
+        <w:tblLook w:val="04A0" w:firstRow="1" w:lastRow="0" w:firstColumn="1" w:lastColumn="0" w:noHBand="0" w:noVBand="1"/>
       </w:tblPr>
       <w:tblGrid>
         <w:gridCol w:w="2100"/>
@@ -1962,7 +1962,7 @@
                 <w:sz w:val="20"/>
                 <w:szCs w:val="20"/>
               </w:rPr>
-              <w:t>Datos personales y de contrato</w:t>
+              <w:t>Datos personales y formación</w:t>
             </w:r>
           </w:p>
         </w:tc>
@@ -2319,10 +2319,10 @@
           <w:noProof/>
         </w:rPr>
         <w:drawing>
-          <wp:inline distT="0" distB="0" distL="0" distR="0" wp14:anchorId="40F94421" wp14:editId="35B77CFB">
+          <wp:inline distT="0" distB="0" distL="0" distR="0" wp14:anchorId="731234FD" wp14:editId="1C87CA5E">
             <wp:extent cx="5391150" cy="2952750"/>
             <wp:effectExtent l="0" t="0" r="0" b="0"/>
-            <wp:docPr id="1173643600" name="Imagen 1173643600"/>
+            <wp:docPr id="983884139" name="Imagen 983884139"/>
             <wp:cNvGraphicFramePr>
               <a:graphicFrameLocks xmlns:a="http://schemas.openxmlformats.org/drawingml/2006/main" noChangeAspect="1"/>
             </wp:cNvGraphicFramePr>
@@ -2377,7 +2377,7 @@
       <w:pPr>
         <w:pStyle w:val="Ttulo2"/>
       </w:pPr>
-      <w:bookmarkStart w:id="7" w:name="_Toc240639724"/>
+      <w:bookmarkStart w:id="7" w:name="_Toc240640315"/>
       <w:r>
         <w:t>3.2 Salida</w:t>
       </w:r>
@@ -2405,7 +2405,7 @@
       <w:pPr>
         <w:pStyle w:val="Ttulo1"/>
       </w:pPr>
-      <w:bookmarkStart w:id="8" w:name="_Toc240639725"/>
+      <w:bookmarkStart w:id="8" w:name="_Toc240640316"/>
       <w:r>
         <w:t>4. PRUEBA CON TRES EMPLEADOS</w:t>
       </w:r>
@@ -2449,7 +2449,7 @@
           <w:left w:w="10" w:type="dxa"/>
           <w:right w:w="10" w:type="dxa"/>
         </w:tblCellMar>
-        <w:tblLook w:val="0000" w:firstRow="0" w:lastRow="0" w:firstColumn="0" w:lastColumn="0" w:noHBand="0" w:noVBand="0"/>
+        <w:tblLook w:val="04A0" w:firstRow="1" w:lastRow="0" w:firstColumn="1" w:lastColumn="0" w:noHBand="0" w:noVBand="1"/>
       </w:tblPr>
       <w:tblGrid>
         <w:gridCol w:w="1300"/>
@@ -2948,10 +2948,10 @@
           <w:noProof/>
         </w:rPr>
         <w:drawing>
-          <wp:inline distT="0" distB="0" distL="0" distR="0" wp14:anchorId="5B427E9A" wp14:editId="20FFB67C">
+          <wp:inline distT="0" distB="0" distL="0" distR="0" wp14:anchorId="206B46C0" wp14:editId="4E85FBFB">
             <wp:extent cx="5391150" cy="2152650"/>
             <wp:effectExtent l="0" t="0" r="0" b="0"/>
-            <wp:docPr id="1765666892" name="Imagen 1765666892"/>
+            <wp:docPr id="1787393168" name="Imagen 1787393168"/>
             <wp:cNvGraphicFramePr>
               <a:graphicFrameLocks xmlns:a="http://schemas.openxmlformats.org/drawingml/2006/main" noChangeAspect="1"/>
             </wp:cNvGraphicFramePr>
@@ -3015,7 +3015,7 @@
       <w:pPr>
         <w:pStyle w:val="Ttulo1"/>
       </w:pPr>
-      <w:bookmarkStart w:id="9" w:name="_Toc240639726"/>
+      <w:bookmarkStart w:id="9" w:name="_Toc240640317"/>
       <w:r>
         <w:t>5. VALIDACIÓN DE LAS ENTRADAS</w:t>
       </w:r>
@@ -3027,7 +3027,7 @@
         <w:jc w:val="both"/>
       </w:pPr>
       <w:r>
-        <w:t>Un servicio que recibe datos de otros sistemas tiene que defenderse de datos mal formados. La validación se declara junto con el formato de entrada (Pydantic) y se aplica antes de que el modelo intervenga: si falta un campo, si un número llega como texto o si una variable categórica trae un valor inexistente, el servicio responde con el código 422 y el detalle exacto del problema.</w:t>
+        <w:t>Un servicio que recibe datos de otros sistemas tiene que defenderse de datos mal formados. La validación se declara junto con el formato de entrada (Pydantic) y se aplica antes de que el modelo intervenga: si falta un campo, si donde va un número llegan letras o si una variable categórica trae un valor inexistente, el servicio responde con el código 422 y el detalle exacto del problema.</w:t>
       </w:r>
     </w:p>
     <w:p>
@@ -3043,7 +3043,7 @@
       <w:pPr>
         <w:pStyle w:val="Ttulo1"/>
       </w:pPr>
-      <w:bookmarkStart w:id="10" w:name="_Toc240639727"/>
+      <w:bookmarkStart w:id="10" w:name="_Toc240640318"/>
       <w:r>
         <w:t>6. EJECUCIÓN Y DEMOSTRACIÓN</w:t>
       </w:r>
@@ -3071,7 +3071,7 @@
       <w:pPr>
         <w:pStyle w:val="Ttulo1"/>
       </w:pPr>
-      <w:bookmarkStart w:id="11" w:name="_Toc240639728"/>
+      <w:bookmarkStart w:id="11" w:name="_Toc240640319"/>
       <w:r>
         <w:t>7. CONCLUSIONES</w:t>
       </w:r>
@@ -3115,7 +3115,7 @@
           <w:left w:w="10" w:type="dxa"/>
           <w:right w:w="10" w:type="dxa"/>
         </w:tblCellMar>
-        <w:tblLook w:val="0000" w:firstRow="0" w:lastRow="0" w:firstColumn="0" w:lastColumn="0" w:noHBand="0" w:noVBand="0"/>
+        <w:tblLook w:val="04A0" w:firstRow="1" w:lastRow="0" w:firstColumn="1" w:lastColumn="0" w:noHBand="0" w:noVBand="1"/>
       </w:tblPr>
       <w:tblGrid>
         <w:gridCol w:w="3000"/>
@@ -3459,7 +3459,7 @@
       <w:pPr>
         <w:pStyle w:val="Ttulo1"/>
       </w:pPr>
-      <w:bookmarkStart w:id="12" w:name="_Toc240639729"/>
+      <w:bookmarkStart w:id="12" w:name="_Toc240640320"/>
       <w:r>
         <w:t>8. LINK COLAB</w:t>
       </w:r>
@@ -3492,7 +3492,7 @@
       <w:pPr>
         <w:pStyle w:val="Ttulo1"/>
       </w:pPr>
-      <w:bookmarkStart w:id="13" w:name="_Toc240639730"/>
+      <w:bookmarkStart w:id="13" w:name="_Toc240640321"/>
       <w:r>
         <w:t>9. REFERENCIAS</w:t>
       </w:r>
@@ -3640,96 +3640,10 @@
 <file path=word/numbering.xml><?xml version="1.0" encoding="utf-8"?>
 <w:numbering xmlns:wpc="http://schemas.microsoft.com/office/word/2010/wordprocessingCanvas" xmlns:cx="http://schemas.microsoft.com/office/drawing/2014/chartex" xmlns:cx1="http://schemas.microsoft.com/office/drawing/2015/9/8/chartex" xmlns:cx2="http://schemas.microsoft.com/office/drawing/2015/10/21/chartex" xmlns:cx3="http://schemas.microsoft.com/office/drawing/2016/5/9/chartex" xmlns:cx4="http://schemas.microsoft.com/office/drawing/2016/5/10/chartex" xmlns:cx5="http://schemas.microsoft.com/office/drawing/2016/5/11/chartex" xmlns:cx6="http://schemas.microsoft.com/office/drawing/2016/5/12/chartex" xmlns:cx7="http://schemas.microsoft.com/office/drawing/2016/5/13/chartex" xmlns:cx8="http://schemas.microsoft.com/office/drawing/2016/5/14/chartex" xmlns:mc="http://schemas.openxmlformats.org/markup-compatibility/2006" xmlns:aink="http://schemas.microsoft.com/office/drawing/2016/ink" xmlns:am3d="http://schemas.microsoft.com/office/drawing/2017/model3d" xmlns:o="urn:schemas-microsoft-com:office:office" xmlns:oel="http://schemas.microsoft.com/office/2019/extlst" xmlns:r="http://schemas.openxmlformats.org/officeDocument/2006/relationships" xmlns:m="http://schemas.openxmlformats.org/officeDocument/2006/math" xmlns:v="urn:schemas-microsoft-com:vml" xmlns:wp14="http://schemas.microsoft.com/office/word/2010/wordprocessingDrawing" xmlns:wp="http://schemas.openxmlformats.org/drawingml/2006/wordprocessingDrawing" xmlns:w10="urn:schemas-microsoft-com:office:word" xmlns:w="http://schemas.openxmlformats.org/wordprocessingml/2006/main" xmlns:w14="http://schemas.microsoft.com/office/word/2010/wordml" xmlns:w15="http://schemas.microsoft.com/office/word/2012/wordml" xmlns:w16cex="http://schemas.microsoft.com/office/word/2018/wordml/cex" xmlns:w16cid="http://schemas.microsoft.com/office/word/2016/wordml/cid" xmlns:w16="http://schemas.microsoft.com/office/word/2018/wordml" xmlns:w16du="http://schemas.microsoft.com/office/word/2023/wordml/word16du" xmlns:w16sdtdh="http://schemas.microsoft.com/office/word/2020/wordml/sdtdatahash" xmlns:w16sdtfl="http://schemas.microsoft.com/office/word/2024/wordml/sdtformatlock" xmlns:w16se="http://schemas.microsoft.com/office/word/2015/wordml/symex" xmlns:wpg="http://schemas.microsoft.com/office/word/2010/wordprocessingGroup" xmlns:wpi="http://schemas.microsoft.com/office/word/2010/wordprocessingInk" xmlns:wne="http://schemas.microsoft.com/office/word/2006/wordml" xmlns:wps="http://schemas.microsoft.com/office/word/2010/wordprocessingShape" mc:Ignorable="w14 w15 w16se w16cid w16 w16cex w16sdtdh w16sdtfl w16du wp14">
   <w:abstractNum w:abstractNumId="0" w15:restartNumberingAfterBreak="0">
-    <w:nsid w:val="2E217101"/>
+    <w:nsid w:val="0FB25403"/>
     <w:multiLevelType w:val="hybridMultilevel"/>
-    <w:tmpl w:val="A2AC458C"/>
-    <w:lvl w:ilvl="0" w:tplc="74C6421E">
-      <w:start w:val="1"/>
-      <w:numFmt w:val="bullet"/>
-      <w:lvlText w:val="●"/>
-      <w:lvlJc w:val="left"/>
-      <w:pPr>
-        <w:ind w:left="720" w:hanging="360"/>
-      </w:pPr>
-    </w:lvl>
-    <w:lvl w:ilvl="1" w:tplc="0646FFCC">
-      <w:start w:val="1"/>
-      <w:numFmt w:val="bullet"/>
-      <w:lvlText w:val="○"/>
-      <w:lvlJc w:val="left"/>
-      <w:pPr>
-        <w:ind w:left="1440" w:hanging="360"/>
-      </w:pPr>
-    </w:lvl>
-    <w:lvl w:ilvl="2" w:tplc="D1E0FB3E">
-      <w:start w:val="1"/>
-      <w:numFmt w:val="bullet"/>
-      <w:lvlText w:val="■"/>
-      <w:lvlJc w:val="left"/>
-      <w:pPr>
-        <w:ind w:left="2160" w:hanging="360"/>
-      </w:pPr>
-    </w:lvl>
-    <w:lvl w:ilvl="3" w:tplc="00AAC10E">
-      <w:start w:val="1"/>
-      <w:numFmt w:val="bullet"/>
-      <w:lvlText w:val="●"/>
-      <w:lvlJc w:val="left"/>
-      <w:pPr>
-        <w:ind w:left="2880" w:hanging="360"/>
-      </w:pPr>
-    </w:lvl>
-    <w:lvl w:ilvl="4" w:tplc="E7180158">
-      <w:start w:val="1"/>
-      <w:numFmt w:val="bullet"/>
-      <w:lvlText w:val="○"/>
-      <w:lvlJc w:val="left"/>
-      <w:pPr>
-        <w:ind w:left="3600" w:hanging="360"/>
-      </w:pPr>
-    </w:lvl>
-    <w:lvl w:ilvl="5" w:tplc="DC229F1C">
-      <w:start w:val="1"/>
-      <w:numFmt w:val="bullet"/>
-      <w:lvlText w:val="■"/>
-      <w:lvlJc w:val="left"/>
-      <w:pPr>
-        <w:ind w:left="4320" w:hanging="360"/>
-      </w:pPr>
-    </w:lvl>
-    <w:lvl w:ilvl="6" w:tplc="A6709C76">
-      <w:start w:val="1"/>
-      <w:numFmt w:val="bullet"/>
-      <w:lvlText w:val="●"/>
-      <w:lvlJc w:val="left"/>
-      <w:pPr>
-        <w:ind w:left="5040" w:hanging="360"/>
-      </w:pPr>
-    </w:lvl>
-    <w:lvl w:ilvl="7" w:tplc="F1329768">
-      <w:start w:val="1"/>
-      <w:numFmt w:val="bullet"/>
-      <w:lvlText w:val="●"/>
-      <w:lvlJc w:val="left"/>
-      <w:pPr>
-        <w:ind w:left="5760" w:hanging="360"/>
-      </w:pPr>
-    </w:lvl>
-    <w:lvl w:ilvl="8" w:tplc="FA8E9ED6">
-      <w:start w:val="1"/>
-      <w:numFmt w:val="bullet"/>
-      <w:lvlText w:val="●"/>
-      <w:lvlJc w:val="left"/>
-      <w:pPr>
-        <w:ind w:left="6480" w:hanging="360"/>
-      </w:pPr>
-    </w:lvl>
-  </w:abstractNum>
-  <w:abstractNum w:abstractNumId="1" w15:restartNumberingAfterBreak="0">
-    <w:nsid w:val="7FCA3840"/>
-    <w:multiLevelType w:val="hybridMultilevel"/>
-    <w:tmpl w:val="5C3E21D4"/>
-    <w:lvl w:ilvl="0" w:tplc="47D2995C">
+    <w:tmpl w:val="6CDA5B68"/>
+    <w:lvl w:ilvl="0" w:tplc="23640B7E">
       <w:start w:val="1"/>
       <w:numFmt w:val="bullet"/>
       <w:lvlText w:val="•"/>
@@ -3738,55 +3652,141 @@
         <w:ind w:left="720" w:hanging="360"/>
       </w:pPr>
     </w:lvl>
-    <w:lvl w:ilvl="1" w:tplc="E4425B1C">
+    <w:lvl w:ilvl="1" w:tplc="212877FA">
       <w:numFmt w:val="decimal"/>
       <w:lvlText w:val=""/>
       <w:lvlJc w:val="left"/>
     </w:lvl>
-    <w:lvl w:ilvl="2" w:tplc="CFA236FA">
+    <w:lvl w:ilvl="2" w:tplc="178809E8">
       <w:numFmt w:val="decimal"/>
       <w:lvlText w:val=""/>
       <w:lvlJc w:val="left"/>
     </w:lvl>
-    <w:lvl w:ilvl="3" w:tplc="76866C48">
+    <w:lvl w:ilvl="3" w:tplc="6F069A40">
       <w:numFmt w:val="decimal"/>
       <w:lvlText w:val=""/>
       <w:lvlJc w:val="left"/>
     </w:lvl>
-    <w:lvl w:ilvl="4" w:tplc="8DEAF71E">
+    <w:lvl w:ilvl="4" w:tplc="0E1E1714">
       <w:numFmt w:val="decimal"/>
       <w:lvlText w:val=""/>
       <w:lvlJc w:val="left"/>
     </w:lvl>
-    <w:lvl w:ilvl="5" w:tplc="D63A0CDA">
+    <w:lvl w:ilvl="5" w:tplc="C380B5F8">
       <w:numFmt w:val="decimal"/>
       <w:lvlText w:val=""/>
       <w:lvlJc w:val="left"/>
     </w:lvl>
-    <w:lvl w:ilvl="6" w:tplc="80F6EC3C">
+    <w:lvl w:ilvl="6" w:tplc="7ED89D0A">
       <w:numFmt w:val="decimal"/>
       <w:lvlText w:val=""/>
       <w:lvlJc w:val="left"/>
     </w:lvl>
-    <w:lvl w:ilvl="7" w:tplc="3E3037CA">
+    <w:lvl w:ilvl="7" w:tplc="273221FE">
       <w:numFmt w:val="decimal"/>
       <w:lvlText w:val=""/>
       <w:lvlJc w:val="left"/>
     </w:lvl>
-    <w:lvl w:ilvl="8" w:tplc="AF8AC1A2">
+    <w:lvl w:ilvl="8" w:tplc="5C92A548">
       <w:numFmt w:val="decimal"/>
       <w:lvlText w:val=""/>
       <w:lvlJc w:val="left"/>
     </w:lvl>
   </w:abstractNum>
-  <w:num w:numId="1" w16cid:durableId="1022167873">
-    <w:abstractNumId w:val="0"/>
+  <w:abstractNum w:abstractNumId="1" w15:restartNumberingAfterBreak="0">
+    <w:nsid w:val="109E2BB9"/>
+    <w:multiLevelType w:val="hybridMultilevel"/>
+    <w:tmpl w:val="D4CE6CEA"/>
+    <w:lvl w:ilvl="0" w:tplc="B554D176">
+      <w:start w:val="1"/>
+      <w:numFmt w:val="bullet"/>
+      <w:lvlText w:val="●"/>
+      <w:lvlJc w:val="left"/>
+      <w:pPr>
+        <w:ind w:left="720" w:hanging="360"/>
+      </w:pPr>
+    </w:lvl>
+    <w:lvl w:ilvl="1" w:tplc="4FAE51F8">
+      <w:start w:val="1"/>
+      <w:numFmt w:val="bullet"/>
+      <w:lvlText w:val="○"/>
+      <w:lvlJc w:val="left"/>
+      <w:pPr>
+        <w:ind w:left="1440" w:hanging="360"/>
+      </w:pPr>
+    </w:lvl>
+    <w:lvl w:ilvl="2" w:tplc="028AAF82">
+      <w:start w:val="1"/>
+      <w:numFmt w:val="bullet"/>
+      <w:lvlText w:val="■"/>
+      <w:lvlJc w:val="left"/>
+      <w:pPr>
+        <w:ind w:left="2160" w:hanging="360"/>
+      </w:pPr>
+    </w:lvl>
+    <w:lvl w:ilvl="3" w:tplc="87B2513E">
+      <w:start w:val="1"/>
+      <w:numFmt w:val="bullet"/>
+      <w:lvlText w:val="●"/>
+      <w:lvlJc w:val="left"/>
+      <w:pPr>
+        <w:ind w:left="2880" w:hanging="360"/>
+      </w:pPr>
+    </w:lvl>
+    <w:lvl w:ilvl="4" w:tplc="206E6E92">
+      <w:start w:val="1"/>
+      <w:numFmt w:val="bullet"/>
+      <w:lvlText w:val="○"/>
+      <w:lvlJc w:val="left"/>
+      <w:pPr>
+        <w:ind w:left="3600" w:hanging="360"/>
+      </w:pPr>
+    </w:lvl>
+    <w:lvl w:ilvl="5" w:tplc="2F96E4A8">
+      <w:start w:val="1"/>
+      <w:numFmt w:val="bullet"/>
+      <w:lvlText w:val="■"/>
+      <w:lvlJc w:val="left"/>
+      <w:pPr>
+        <w:ind w:left="4320" w:hanging="360"/>
+      </w:pPr>
+    </w:lvl>
+    <w:lvl w:ilvl="6" w:tplc="9D36C272">
+      <w:start w:val="1"/>
+      <w:numFmt w:val="bullet"/>
+      <w:lvlText w:val="●"/>
+      <w:lvlJc w:val="left"/>
+      <w:pPr>
+        <w:ind w:left="5040" w:hanging="360"/>
+      </w:pPr>
+    </w:lvl>
+    <w:lvl w:ilvl="7" w:tplc="358A3F94">
+      <w:start w:val="1"/>
+      <w:numFmt w:val="bullet"/>
+      <w:lvlText w:val="●"/>
+      <w:lvlJc w:val="left"/>
+      <w:pPr>
+        <w:ind w:left="5760" w:hanging="360"/>
+      </w:pPr>
+    </w:lvl>
+    <w:lvl w:ilvl="8" w:tplc="74C41B0C">
+      <w:start w:val="1"/>
+      <w:numFmt w:val="bullet"/>
+      <w:lvlText w:val="●"/>
+      <w:lvlJc w:val="left"/>
+      <w:pPr>
+        <w:ind w:left="6480" w:hanging="360"/>
+      </w:pPr>
+    </w:lvl>
+  </w:abstractNum>
+  <w:num w:numId="1" w16cid:durableId="1513642508">
+    <w:abstractNumId w:val="1"/>
     <w:lvlOverride w:ilvl="0">
       <w:startOverride w:val="1"/>
     </w:lvlOverride>
   </w:num>
-  <w:num w:numId="2" w16cid:durableId="221447052">
-    <w:abstractNumId w:val="1"/>
+  <w:num w:numId="2" w16cid:durableId="151068497">
+    <w:abstractNumId w:val="0"/>
     <w:lvlOverride w:ilvl="0">
       <w:startOverride w:val="1"/>
     </w:lvlOverride>
@@ -4406,7 +4406,7 @@
     <w:autoRedefine/>
     <w:uiPriority w:val="39"/>
     <w:unhideWhenUsed/>
-    <w:rsid w:val="00542B24"/>
+    <w:rsid w:val="005F7E3B"/>
     <w:pPr>
       <w:spacing w:after="100"/>
     </w:pPr>
@@ -4418,7 +4418,7 @@
     <w:autoRedefine/>
     <w:uiPriority w:val="39"/>
     <w:unhideWhenUsed/>
-    <w:rsid w:val="00542B24"/>
+    <w:rsid w:val="005F7E3B"/>
     <w:pPr>
       <w:spacing w:after="100"/>
       <w:ind w:left="220"/>

</xml_diff>